<commit_message>
Reencuadre teorico: institucionalizacion, nacionalizacion y nicho
Renombra los clusters del segundo nivel (Vehiculo/Nicho/Elite ->
Partido vehiculo / Partido de nicho / Partido institucionalizado)
con base en Panebianco (1988), Mainwaring & Scully (1995), Jones &
Mainwaring (2003) y Meguid (2005). Agrega seccion 5.5 con longevidad
organizativa por cluster como prueba independiente del clustering,
seccion de Referencias, script 13, y el nombre del autor (Andrez
Felipe Guerrero Torres).
</commit_message>
<xml_diff>
--- a/reporte/Reporte_Final_Partidos_Politicos.docx
+++ b/reporte/Reporte_Final_Partidos_Politicos.docx
@@ -88,11 +88,92 @@
       <w:r>
         <w:rPr>
           <w:rFonts w:ascii="Calibri" w:cs="Calibri" w:eastAsia="Calibri" w:hAnsi="Calibri"/>
+          <w:b/>
+          <w:bCs/>
+          <w:sz w:val="22"/>
+          <w:szCs w:val="22"/>
+        </w:rPr>
+        <w:t xml:space="preserve">Autor: Andrez Felipe Guerrero Torres</w:t>
+      </w:r>
+    </w:p>
+    <w:p>
+      <w:pPr>
+        <w:spacing w:before="200"/>
+        <w:jc w:val="center"/>
+      </w:pPr>
+      <w:r>
+        <w:rPr>
+          <w:rFonts w:ascii="Calibri" w:cs="Calibri" w:eastAsia="Calibri" w:hAnsi="Calibri"/>
           <w:color w:val="595959"/>
           <w:sz w:val="20"/>
           <w:szCs w:val="20"/>
         </w:rPr>
         <w:t xml:space="preserve">Base de datos: CEDE – Universidad de los Andes, clasificación de partidos políticos colombianos</w:t>
+      </w:r>
+    </w:p>
+    <w:p>
+      <w:r>
+        <w:br w:type="page"/>
+      </w:r>
+    </w:p>
+    <w:p>
+      <w:pPr>
+        <w:pStyle w:val="Heading1"/>
+      </w:pPr>
+      <w:r>
+        <w:t xml:space="preserve">Resumen de los datos y su preparación</w:t>
+      </w:r>
+    </w:p>
+    <w:p>
+      <w:pPr>
+        <w:spacing w:after="160" w:line="276"/>
+      </w:pPr>
+      <w:r>
+        <w:rPr>
+          <w:rFonts w:ascii="Calibri" w:cs="Calibri" w:eastAsia="Calibri" w:hAnsi="Calibri"/>
+          <w:sz w:val="22"/>
+          <w:szCs w:val="22"/>
+        </w:rPr>
+        <w:t xml:space="preserve">Este reporte combina dos fuentes de datos. La primera es la clasificación de partidos y movimientos políticos colombianos del CEDE (Universidad de los Andes): 5.143 organizaciones registradas entre 1848 y 2022, con variables de ideología, carácter tradicional, grado de nacionalización, grupo representativo y participación binaria (0/1) en siete tipos de elección (alcaldía, asamblea, cámara, concejo, gobernación, presidencia y senado). Al revisar esta base se descubrió que el 58% de las filas (2.988) no son partidos propiamente dichos, sino coaliciones ad hoc de alcance municipal o departamental (p. ej. “COALICION CONCEJO DE X. PARTIDO Y Y PARTIDO Z”), un hecho que se usó para depurar los análisis posteriores.</w:t>
+      </w:r>
+    </w:p>
+    <w:p>
+      <w:pPr>
+        <w:spacing w:after="160" w:line="276"/>
+      </w:pPr>
+      <w:r>
+        <w:rPr>
+          <w:rFonts w:ascii="Calibri" w:cs="Calibri" w:eastAsia="Calibri" w:hAnsi="Calibri"/>
+          <w:sz w:val="22"/>
+          <w:szCs w:val="22"/>
+        </w:rPr>
+        <w:t xml:space="preserve">La segunda fuente son los resultados electorales históricos de la Registraduría/CEDE para 1958–2023 (~130 archivos, 2,5 GB), a nivel de candidato-municipio-elección, para los mismos siete tipos de elección. Estos se cruzaron por nombre con la primera base (tras excluir las coaliciones y normalizar texto —mayúsculas, sin tildes ni puntuación, sin palabras genéricas como “PARTIDO” o “MOVIMIENTO”—) logrando emparejar el 80,6% de los votos históricos no-coalición.</w:t>
+      </w:r>
+    </w:p>
+    <w:p>
+      <w:pPr>
+        <w:spacing w:after="160" w:line="276"/>
+      </w:pPr>
+      <w:r>
+        <w:rPr>
+          <w:rFonts w:ascii="Calibri" w:cs="Calibri" w:eastAsia="Calibri" w:hAnsi="Calibri"/>
+          <w:sz w:val="22"/>
+          <w:szCs w:val="22"/>
+        </w:rPr>
+        <w:t xml:space="preserve">La preparación de los datos incluyó, entre otros pasos: limpieza de nombres de variables; imputación cuidadosa de valores faltantes evitando fabricar señal falsa en variables con códigos centinela 98/99 (11%–99% de los casos según la variable); codificación dummy consistente de las variables categóricas (corrigiendo un error de codificación asimétrica detectado durante la revisión, ver sección 7); estandarización (z-score) de todas las variables antes del clustering; y, para el análisis con votos, una transformación logarítmica log(1+votos) dado su fuerte sesgo a la derecha. El detalle completo de cada paso se documenta en las secciones 4 y 5.</w:t>
+      </w:r>
+    </w:p>
+    <w:p>
+      <w:pPr>
+        <w:spacing w:after="160" w:line="276"/>
+      </w:pPr>
+      <w:r>
+        <w:rPr>
+          <w:rFonts w:ascii="Calibri" w:cs="Calibri" w:eastAsia="Calibri" w:hAnsi="Calibri"/>
+          <w:sz w:val="22"/>
+          <w:szCs w:val="22"/>
+        </w:rPr>
+        <w:t xml:space="preserve">Con estos insumos se construyeron dos niveles de análisis: (1) un modelo de K-Means sobre el universo completo de 5.143 organizaciones usando participación binaria (secciones 4–6), y (2) un segundo modelo, restringido a los 2.155 partidos no-coalición y enriquecido con los votos reales por nivel electoral (sección 5.4), que sirve como validación cruzada del primero con otra fuente de datos.</w:t>
       </w:r>
     </w:p>
     <w:p>
@@ -152,7 +233,7 @@
           <w:sz w:val="22"/>
           <w:szCs w:val="22"/>
         </w:rPr>
-        <w:t xml:space="preserve">El debate sobre la proliferación de partidos y movimientos políticos —popularmente conocidos como “partidos de garaje” o “microempresas electorales”— ha sido central en las reformas al régimen de partidos en Colombia (Acto Legislativo 01 de 2003, Ley 1475 de 2011 y las discusiones de reforma política de 2023–2025). La preocupación de fondo es que un número elevado de organizaciones obtienen o mantienen personería jurídica sin construir una presencia electoral real ni una identidad programática, lo que fragmenta la representación, dificulta la rendición de cuentas y encarece la administración electoral (tarjetones, financiación estatal, curules).</w:t>
+        <w:t xml:space="preserve">La forma más habitual de describir a un partido colombiano es por su etiqueta ideológica (izquierda, derecha, centro). Pero los propios datos de este reporte muestran que esa etiqueta es un marcador débil e inconsistente: cerca del 40% de los partidos históricos no tiene ideología clasificable, y —de forma casi paradójica (sección 5.4)— los partidos electoralmente más exitosos son también los que con mayor frecuencia carecen de clasificación ideológica. Ideología, entonces, no es el eje más útil para tipificar a un partido colombiano.</w:t>
       </w:r>
     </w:p>
     <w:p>
@@ -165,7 +246,7 @@
           <w:sz w:val="22"/>
           <w:szCs w:val="22"/>
         </w:rPr>
-        <w:t xml:space="preserve">A la vez, la literatura sobre sistemas de partidos en Colombia (Pizarro León-Gómez, Gutierrez Sannín, entre otros) documenta una fragmentación ideológica creciente desde el colapso del bipartidismo tradicional en los años 2000, con partidos cada vez más personalistas y menos programáticos. Sin embargo, buena parte de ese diagnóstico se apoya en estudios de caso o en el análisis de las principales colectividades, sin cuantificar sistemáticamente, sobre el universo completo de partidos alguna vez registrados, cuántos operan efectivamente como maquinarias multinivel y cuántos son vehículos marginales.</w:t>
+        <w:t xml:space="preserve">La literatura sobre sistemas de partidos ofrece dimensiones teóricas más robustas y, sobre todo, más observables en los datos disponibles. Panebianco (1988) y Mainwaring y Scully (1995) definen la institucionalización partidista como la capacidad de una organización de sobrevivir y reproducirse en el tiempo más allá de sus fundadores, en oposición a partidos personalistas construidos alrededor de un líder o una elección puntual; empíricamente, esa capacidad se aproxima con la longevidad organizativa. Jones y Mainwaring (2003) proponen la nacionalización electoral —la competencia sostenida de un partido en múltiples niveles y territorios, no solo en uno— como el complemento natural de la institucionalización. Y Meguid (2005) caracteriza a los partidos de nicho como aquellos que compiten sobre una dimensión estrecha y no económica (étnica, religiosa, sectorial) en vez de la disputa ideológica izquierda-derecha convencional. Estas tres nociones —institucionalización (longevidad), nacionalización (alcance multinivel) y nicho— son las que se usan en este reporte para nombrar e interpretar los perfiles encontrados, en lugar de depender de la clasificación ideológica registrada en la base.</w:t>
       </w:r>
     </w:p>
     <w:p>
@@ -178,7 +259,33 @@
           <w:sz w:val="22"/>
           <w:szCs w:val="22"/>
         </w:rPr>
-        <w:t xml:space="preserve">Este reporte busca llenar ese vacío: usando técnicas de agrupamiento no supervisado sobre la base histórica más completa disponible (CEDE–Uniandes, 5.143 partidos y movimientos entre 1848 y 2022), se construye una tipología empírica que permite cuantificar cuántas organizaciones corresponden a cada perfil. El hallazgo central —que menos del 2% de las organizaciones históricas se comporta como maquinaria electoral multinivel real, mientras el resto opera de forma marginal o local— aporta evidencia directa y cuantificada al diseño de umbrales de personería jurídica, reglas de coalición y fórmulas de financiación estatal por desempeño electoral.</w:t>
+        <w:t xml:space="preserve">Esta relectura no es solo académica: el debate sobre la proliferación de partidos y movimientos políticos —popularmente conocidos como “partidos de garaje” o “microempresas electorales”— ha sido central en las reformas al régimen de partidos en Colombia (Acto Legislativo 01 de 2003, Ley 1475 de 2011 y las discusiones de reforma política de 2023–2025). La preocupación de fondo es que un número elevado de organizaciones obtienen o mantienen personería jurídica sin construir una presencia electoral real ni una organización duradera, lo que fragmenta la representación, dificulta la rendición de cuentas y encarece la administración electoral (tarjetones, financiación estatal, curules). Si la ideología no distingue bien a estos partidos, la institucionalización y la nacionalización sí podrían hacerlo, y de forma más directamente accionable para el diseño de reglas (umbrales, financiación).</w:t>
+      </w:r>
+    </w:p>
+    <w:p>
+      <w:pPr>
+        <w:spacing w:after="160" w:line="276"/>
+      </w:pPr>
+      <w:r>
+        <w:rPr>
+          <w:rFonts w:ascii="Calibri" w:cs="Calibri" w:eastAsia="Calibri" w:hAnsi="Calibri"/>
+          <w:sz w:val="22"/>
+          <w:szCs w:val="22"/>
+        </w:rPr>
+        <w:t xml:space="preserve">A la vez, la literatura sobre sistemas de partidos en Colombia (Pizarro León-Gómez, Gutiérrez Sánchez, entre otros) documenta una fragmentación creciente desde el colapso del bipartidismo tradicional en los años 2000, con partidos cada vez más personalistas y menos institucionalizados. Sin embargo, buena parte de ese diagnóstico se apoya en estudios de caso o en el análisis de las principales colectividades, sin cuantificar sistemáticamente, sobre el universo completo de partidos alguna vez registrados, cuántos son organizaciones institucionalizadas y nacionalizadas y cuántos son vehículos electorales efímeros.</w:t>
+      </w:r>
+    </w:p>
+    <w:p>
+      <w:pPr>
+        <w:spacing w:after="160" w:line="276"/>
+      </w:pPr>
+      <w:r>
+        <w:rPr>
+          <w:rFonts w:ascii="Calibri" w:cs="Calibri" w:eastAsia="Calibri" w:hAnsi="Calibri"/>
+          <w:sz w:val="22"/>
+          <w:szCs w:val="22"/>
+        </w:rPr>
+        <w:t xml:space="preserve">Este reporte busca llenar ese vacío: usando técnicas de agrupamiento no supervisado sobre la base histórica más completa disponible (CEDE–Uniandes, 5.143 partidos y movimientos entre 1848 y 2022), se construye una tipología empírica —anclada en institucionalización, nacionalización y nicho— que permite cuantificar cuántas organizaciones corresponden a cada perfil. El hallazgo central —que menos del 2% de las organizaciones históricas está institucionalizado y nacionalizado, mientras el resto opera de forma efímera o local— aporta evidencia directa y cuantificada al diseño de umbrales de personería jurídica, reglas de coalición y fórmulas de financiación estatal por desempeño electoral.</w:t>
       </w:r>
     </w:p>
     <w:p>
@@ -4834,7 +4941,7 @@
                 <w:sz w:val="20"/>
                 <w:szCs w:val="20"/>
               </w:rPr>
-              <w:t xml:space="preserve">Vehículo marginal</w:t>
+              <w:t xml:space="preserve">Partido vehículo</w:t>
             </w:r>
           </w:p>
         </w:tc>
@@ -5006,7 +5113,7 @@
                 <w:sz w:val="20"/>
                 <w:szCs w:val="20"/>
               </w:rPr>
-              <w:t xml:space="preserve">Nicho / identitario</w:t>
+              <w:t xml:space="preserve">Partido de nicho</w:t>
             </w:r>
           </w:p>
         </w:tc>
@@ -5178,7 +5285,7 @@
                 <w:sz w:val="20"/>
                 <w:szCs w:val="20"/>
               </w:rPr>
-              <w:t xml:space="preserve">Élite nacional</w:t>
+              <w:t xml:space="preserve">Partido institucionalizado</w:t>
             </w:r>
           </w:p>
         </w:tc>
@@ -5684,7 +5791,7 @@
                 <w:sz w:val="20"/>
                 <w:szCs w:val="20"/>
               </w:rPr>
-              <w:t xml:space="preserve">Vehículo marginal</w:t>
+              <w:t xml:space="preserve">Partido vehículo</w:t>
             </w:r>
           </w:p>
         </w:tc>
@@ -5958,7 +6065,7 @@
                 <w:sz w:val="20"/>
                 <w:szCs w:val="20"/>
               </w:rPr>
-              <w:t xml:space="preserve">Nicho / identitario</w:t>
+              <w:t xml:space="preserve">Partido de nicho</w:t>
             </w:r>
           </w:p>
         </w:tc>
@@ -6232,7 +6339,7 @@
                 <w:sz w:val="20"/>
                 <w:szCs w:val="20"/>
               </w:rPr>
-              <w:t xml:space="preserve">Élite nacional</w:t>
+              <w:t xml:space="preserve">Partido institucionalizado</w:t>
             </w:r>
           </w:p>
         </w:tc>
@@ -6499,7 +6606,7 @@
           <w:sz w:val="22"/>
           <w:szCs w:val="22"/>
         </w:rPr>
-        <w:t xml:space="preserve">El patrón se sostiene en los siete niveles: el cluster “Élite nacional” supera al “Vehículo marginal” por un factor de 60 a 1.300 veces según el nivel, y no es simplemente un resultado impulsado por una sola elección (por ejemplo, solo presidencia o solo senado). El cluster “Nicho/identitario” se distingue por una presencia relativamente alta en gobernación y presidencia frente a una votación mínima en senado, coherente con partidos de representación de intereses específicos que rara vez compiten a nivel nacional.</w:t>
+        <w:t xml:space="preserve">El patrón se sostiene en los siete niveles: el cluster “Partido institucionalizado” supera al “Partido vehículo” por un factor de 60 a 1.300 veces según el nivel, y no es simplemente un resultado impulsado por una sola elección (por ejemplo, solo presidencia o solo senado). El cluster “Partido de nicho” se distingue por una presencia relativamente alta en gobernación y presidencia frente a una votación mínima en senado, coherente con partidos de representación de intereses específicos que rara vez compiten a nivel nacional.</w:t>
       </w:r>
     </w:p>
     <w:p>
@@ -6574,7 +6681,770 @@
           <w:sz w:val="22"/>
           <w:szCs w:val="22"/>
         </w:rPr>
-        <w:t xml:space="preserve">El cluster “Élite nacional” (4,8% de los partidos no-coalición) incluye, de forma reconocible, al Partido Liberal Colombiano (43,6 millones de votos históricos acumulados al Senado), Partido Conservador Colombiano (30,5 millones), Cambio Radical, Polo Democrático Alternativo, Alianza Verde, Nuevo Liberalismo y Opción Ciudadana, entre otros. Este resultado, obtenido con la magnitud real del respaldo electoral y restringido a partidos genuinos (sin las coaliciones ad hoc), corrobora con otra fuente de datos el hallazgo central de la sección 6: una fracción muy pequeña de las organizaciones políticas colombianas concentra la enorme mayoría del músculo electoral real del país.</w:t>
+        <w:t xml:space="preserve">El cluster “Partido institucionalizado” (4,8% de los partidos no-coalición) incluye, de forma reconocible, al Partido Liberal Colombiano (43,6 millones de votos históricos acumulados al Senado), Partido Conservador Colombiano (30,5 millones), Cambio Radical, Polo Democrático Alternativo, Alianza Verde, Nuevo Liberalismo y Opción Ciudadana, entre otros. Este resultado, obtenido con la magnitud real del respaldo electoral y restringido a partidos genuinos (sin las coaliciones ad hoc), corrobora con otra fuente de datos el hallazgo central de la sección 6: una fracción muy pequeña de las organizaciones políticas colombianas concentra la enorme mayoría del músculo electoral real del país.</w:t>
+      </w:r>
+    </w:p>
+    <w:p>
+      <w:pPr>
+        <w:pStyle w:val="Heading2"/>
+      </w:pPr>
+      <w:r>
+        <w:t xml:space="preserve">5.5 Longevidad organizativa: la institucionalización puesta a prueba</w:t>
+      </w:r>
+    </w:p>
+    <w:p>
+      <w:pPr>
+        <w:spacing w:after="160" w:line="276"/>
+      </w:pPr>
+      <w:r>
+        <w:rPr>
+          <w:rFonts w:ascii="Calibri" w:cs="Calibri" w:eastAsia="Calibri" w:hAnsi="Calibri"/>
+          <w:sz w:val="22"/>
+          <w:szCs w:val="22"/>
+        </w:rPr>
+        <w:t xml:space="preserve">Si la institucionalización se define, siguiendo a Panebianco (1988) y Mainwaring y Scully (1995), como la capacidad de una organización de sobrevivir en el tiempo más allá de su fundación, entonces la longevidad de cada partido (calculada a partir del campo temporalidad, como años entre su fundación y su último registro) ofrece una prueba directa —independiente del ejercicio de clustering— de si los nombres asignados a los tres perfiles del segundo nivel son sustantivamente adecuados.</w:t>
+      </w:r>
+    </w:p>
+    <w:tbl>
+      <w:tblPr>
+        <w:tblW w:type="dxa" w:w="9360"/>
+        <w:tblBorders>
+          <w:top w:val="single" w:color="auto" w:sz="4"/>
+          <w:left w:val="single" w:color="auto" w:sz="4"/>
+          <w:bottom w:val="single" w:color="auto" w:sz="4"/>
+          <w:right w:val="single" w:color="auto" w:sz="4"/>
+          <w:insideH w:val="single" w:color="auto" w:sz="4"/>
+          <w:insideV w:val="single" w:color="auto" w:sz="4"/>
+        </w:tblBorders>
+      </w:tblPr>
+      <w:tblGrid>
+        <w:gridCol w:w="2600"/>
+        <w:gridCol w:w="1000"/>
+        <w:gridCol w:w="2000"/>
+        <w:gridCol w:w="1980"/>
+        <w:gridCol w:w="1780"/>
+      </w:tblGrid>
+      <w:tr>
+        <w:trPr>
+          <w:tblHeader/>
+        </w:trPr>
+        <w:tc>
+          <w:tcPr>
+            <w:tcW w:type="dxa" w:w="2600"/>
+            <w:tcBorders>
+              <w:top w:val="single" w:color="BFBFBF" w:sz="2"/>
+              <w:left w:val="single" w:color="BFBFBF" w:sz="2"/>
+              <w:bottom w:val="single" w:color="BFBFBF" w:sz="2"/>
+              <w:right w:val="single" w:color="BFBFBF" w:sz="2"/>
+            </w:tcBorders>
+            <w:shd w:fill="1F4E5F" w:val="clear"/>
+            <w:tcMar>
+              <w:top w:type="dxa" w:w="60"/>
+              <w:left w:type="dxa" w:w="100"/>
+              <w:bottom w:type="dxa" w:w="60"/>
+              <w:right w:type="dxa" w:w="100"/>
+            </w:tcMar>
+            <w:vAlign w:val="center"/>
+          </w:tcPr>
+          <w:p>
+            <w:pPr>
+              <w:jc w:val="center"/>
+            </w:pPr>
+            <w:r>
+              <w:rPr>
+                <w:rFonts w:ascii="Calibri" w:cs="Calibri" w:eastAsia="Calibri" w:hAnsi="Calibri"/>
+                <w:b/>
+                <w:bCs/>
+                <w:color w:val="FFFFFF"/>
+                <w:sz w:val="20"/>
+                <w:szCs w:val="20"/>
+              </w:rPr>
+              <w:t xml:space="preserve">Cluster</w:t>
+            </w:r>
+          </w:p>
+        </w:tc>
+        <w:tc>
+          <w:tcPr>
+            <w:tcW w:type="dxa" w:w="1000"/>
+            <w:tcBorders>
+              <w:top w:val="single" w:color="BFBFBF" w:sz="2"/>
+              <w:left w:val="single" w:color="BFBFBF" w:sz="2"/>
+              <w:bottom w:val="single" w:color="BFBFBF" w:sz="2"/>
+              <w:right w:val="single" w:color="BFBFBF" w:sz="2"/>
+            </w:tcBorders>
+            <w:shd w:fill="1F4E5F" w:val="clear"/>
+            <w:tcMar>
+              <w:top w:type="dxa" w:w="60"/>
+              <w:left w:type="dxa" w:w="100"/>
+              <w:bottom w:type="dxa" w:w="60"/>
+              <w:right w:type="dxa" w:w="100"/>
+            </w:tcMar>
+            <w:vAlign w:val="center"/>
+          </w:tcPr>
+          <w:p>
+            <w:pPr>
+              <w:jc w:val="center"/>
+            </w:pPr>
+            <w:r>
+              <w:rPr>
+                <w:rFonts w:ascii="Calibri" w:cs="Calibri" w:eastAsia="Calibri" w:hAnsi="Calibri"/>
+                <w:b/>
+                <w:bCs/>
+                <w:color w:val="FFFFFF"/>
+                <w:sz w:val="20"/>
+                <w:szCs w:val="20"/>
+              </w:rPr>
+              <w:t xml:space="preserve">n</w:t>
+            </w:r>
+          </w:p>
+        </w:tc>
+        <w:tc>
+          <w:tcPr>
+            <w:tcW w:type="dxa" w:w="2000"/>
+            <w:tcBorders>
+              <w:top w:val="single" w:color="BFBFBF" w:sz="2"/>
+              <w:left w:val="single" w:color="BFBFBF" w:sz="2"/>
+              <w:bottom w:val="single" w:color="BFBFBF" w:sz="2"/>
+              <w:right w:val="single" w:color="BFBFBF" w:sz="2"/>
+            </w:tcBorders>
+            <w:shd w:fill="1F4E5F" w:val="clear"/>
+            <w:tcMar>
+              <w:top w:type="dxa" w:w="60"/>
+              <w:left w:type="dxa" w:w="100"/>
+              <w:bottom w:type="dxa" w:w="60"/>
+              <w:right w:type="dxa" w:w="100"/>
+            </w:tcMar>
+            <w:vAlign w:val="center"/>
+          </w:tcPr>
+          <w:p>
+            <w:pPr>
+              <w:jc w:val="center"/>
+            </w:pPr>
+            <w:r>
+              <w:rPr>
+                <w:rFonts w:ascii="Calibri" w:cs="Calibri" w:eastAsia="Calibri" w:hAnsi="Calibri"/>
+                <w:b/>
+                <w:bCs/>
+                <w:color w:val="FFFFFF"/>
+                <w:sz w:val="20"/>
+                <w:szCs w:val="20"/>
+              </w:rPr>
+              <w:t xml:space="preserve">Longevidad promedio (años)</w:t>
+            </w:r>
+          </w:p>
+        </w:tc>
+        <w:tc>
+          <w:tcPr>
+            <w:tcW w:type="dxa" w:w="1980"/>
+            <w:tcBorders>
+              <w:top w:val="single" w:color="BFBFBF" w:sz="2"/>
+              <w:left w:val="single" w:color="BFBFBF" w:sz="2"/>
+              <w:bottom w:val="single" w:color="BFBFBF" w:sz="2"/>
+              <w:right w:val="single" w:color="BFBFBF" w:sz="2"/>
+            </w:tcBorders>
+            <w:shd w:fill="1F4E5F" w:val="clear"/>
+            <w:tcMar>
+              <w:top w:type="dxa" w:w="60"/>
+              <w:left w:type="dxa" w:w="100"/>
+              <w:bottom w:type="dxa" w:w="60"/>
+              <w:right w:type="dxa" w:w="100"/>
+            </w:tcMar>
+            <w:vAlign w:val="center"/>
+          </w:tcPr>
+          <w:p>
+            <w:pPr>
+              <w:jc w:val="center"/>
+            </w:pPr>
+            <w:r>
+              <w:rPr>
+                <w:rFonts w:ascii="Calibri" w:cs="Calibri" w:eastAsia="Calibri" w:hAnsi="Calibri"/>
+                <w:b/>
+                <w:bCs/>
+                <w:color w:val="FFFFFF"/>
+                <w:sz w:val="20"/>
+                <w:szCs w:val="20"/>
+              </w:rPr>
+              <w:t xml:space="preserve">Longevidad mediana (años)</w:t>
+            </w:r>
+          </w:p>
+        </w:tc>
+        <w:tc>
+          <w:tcPr>
+            <w:tcW w:type="dxa" w:w="1780"/>
+            <w:tcBorders>
+              <w:top w:val="single" w:color="BFBFBF" w:sz="2"/>
+              <w:left w:val="single" w:color="BFBFBF" w:sz="2"/>
+              <w:bottom w:val="single" w:color="BFBFBF" w:sz="2"/>
+              <w:right w:val="single" w:color="BFBFBF" w:sz="2"/>
+            </w:tcBorders>
+            <w:shd w:fill="1F4E5F" w:val="clear"/>
+            <w:tcMar>
+              <w:top w:type="dxa" w:w="60"/>
+              <w:left w:type="dxa" w:w="100"/>
+              <w:bottom w:type="dxa" w:w="60"/>
+              <w:right w:type="dxa" w:w="100"/>
+            </w:tcMar>
+            <w:vAlign w:val="center"/>
+          </w:tcPr>
+          <w:p>
+            <w:pPr>
+              <w:jc w:val="center"/>
+            </w:pPr>
+            <w:r>
+              <w:rPr>
+                <w:rFonts w:ascii="Calibri" w:cs="Calibri" w:eastAsia="Calibri" w:hAnsi="Calibri"/>
+                <w:b/>
+                <w:bCs/>
+                <w:color w:val="FFFFFF"/>
+                <w:sz w:val="20"/>
+                <w:szCs w:val="20"/>
+              </w:rPr>
+              <w:t xml:space="preserve">Longevidad máxima (años)</w:t>
+            </w:r>
+          </w:p>
+        </w:tc>
+      </w:tr>
+      <w:tr>
+        <w:tc>
+          <w:tcPr>
+            <w:tcW w:type="dxa" w:w="2600"/>
+            <w:tcBorders>
+              <w:top w:val="single" w:color="BFBFBF" w:sz="2"/>
+              <w:left w:val="single" w:color="BFBFBF" w:sz="2"/>
+              <w:bottom w:val="single" w:color="BFBFBF" w:sz="2"/>
+              <w:right w:val="single" w:color="BFBFBF" w:sz="2"/>
+            </w:tcBorders>
+            <w:tcMar>
+              <w:top w:type="dxa" w:w="60"/>
+              <w:left w:type="dxa" w:w="100"/>
+              <w:bottom w:type="dxa" w:w="60"/>
+              <w:right w:type="dxa" w:w="100"/>
+            </w:tcMar>
+            <w:vAlign w:val="center"/>
+          </w:tcPr>
+          <w:p>
+            <w:pPr>
+              <w:jc w:val="left"/>
+            </w:pPr>
+            <w:r>
+              <w:rPr>
+                <w:rFonts w:ascii="Calibri" w:cs="Calibri" w:eastAsia="Calibri" w:hAnsi="Calibri"/>
+                <w:b w:val="false"/>
+                <w:bCs w:val="false"/>
+                <w:color w:val="000000"/>
+                <w:sz w:val="20"/>
+                <w:szCs w:val="20"/>
+              </w:rPr>
+              <w:t xml:space="preserve">Partido vehículo</w:t>
+            </w:r>
+          </w:p>
+        </w:tc>
+        <w:tc>
+          <w:tcPr>
+            <w:tcW w:type="dxa" w:w="1000"/>
+            <w:tcBorders>
+              <w:top w:val="single" w:color="BFBFBF" w:sz="2"/>
+              <w:left w:val="single" w:color="BFBFBF" w:sz="2"/>
+              <w:bottom w:val="single" w:color="BFBFBF" w:sz="2"/>
+              <w:right w:val="single" w:color="BFBFBF" w:sz="2"/>
+            </w:tcBorders>
+            <w:tcMar>
+              <w:top w:type="dxa" w:w="60"/>
+              <w:left w:type="dxa" w:w="100"/>
+              <w:bottom w:type="dxa" w:w="60"/>
+              <w:right w:type="dxa" w:w="100"/>
+            </w:tcMar>
+            <w:vAlign w:val="center"/>
+          </w:tcPr>
+          <w:p>
+            <w:pPr>
+              <w:jc w:val="center"/>
+            </w:pPr>
+            <w:r>
+              <w:rPr>
+                <w:rFonts w:ascii="Calibri" w:cs="Calibri" w:eastAsia="Calibri" w:hAnsi="Calibri"/>
+                <w:b w:val="false"/>
+                <w:bCs w:val="false"/>
+                <w:color w:val="000000"/>
+                <w:sz w:val="20"/>
+                <w:szCs w:val="20"/>
+              </w:rPr>
+              <w:t xml:space="preserve">1,854</w:t>
+            </w:r>
+          </w:p>
+        </w:tc>
+        <w:tc>
+          <w:tcPr>
+            <w:tcW w:type="dxa" w:w="2000"/>
+            <w:tcBorders>
+              <w:top w:val="single" w:color="BFBFBF" w:sz="2"/>
+              <w:left w:val="single" w:color="BFBFBF" w:sz="2"/>
+              <w:bottom w:val="single" w:color="BFBFBF" w:sz="2"/>
+              <w:right w:val="single" w:color="BFBFBF" w:sz="2"/>
+            </w:tcBorders>
+            <w:tcMar>
+              <w:top w:type="dxa" w:w="60"/>
+              <w:left w:type="dxa" w:w="100"/>
+              <w:bottom w:type="dxa" w:w="60"/>
+              <w:right w:type="dxa" w:w="100"/>
+            </w:tcMar>
+            <w:vAlign w:val="center"/>
+          </w:tcPr>
+          <w:p>
+            <w:pPr>
+              <w:jc w:val="center"/>
+            </w:pPr>
+            <w:r>
+              <w:rPr>
+                <w:rFonts w:ascii="Calibri" w:cs="Calibri" w:eastAsia="Calibri" w:hAnsi="Calibri"/>
+                <w:b w:val="false"/>
+                <w:bCs w:val="false"/>
+                <w:color w:val="000000"/>
+                <w:sz w:val="20"/>
+                <w:szCs w:val="20"/>
+              </w:rPr>
+              <w:t xml:space="preserve">0.5</w:t>
+            </w:r>
+          </w:p>
+        </w:tc>
+        <w:tc>
+          <w:tcPr>
+            <w:tcW w:type="dxa" w:w="1980"/>
+            <w:tcBorders>
+              <w:top w:val="single" w:color="BFBFBF" w:sz="2"/>
+              <w:left w:val="single" w:color="BFBFBF" w:sz="2"/>
+              <w:bottom w:val="single" w:color="BFBFBF" w:sz="2"/>
+              <w:right w:val="single" w:color="BFBFBF" w:sz="2"/>
+            </w:tcBorders>
+            <w:tcMar>
+              <w:top w:type="dxa" w:w="60"/>
+              <w:left w:type="dxa" w:w="100"/>
+              <w:bottom w:type="dxa" w:w="60"/>
+              <w:right w:type="dxa" w:w="100"/>
+            </w:tcMar>
+            <w:vAlign w:val="center"/>
+          </w:tcPr>
+          <w:p>
+            <w:pPr>
+              <w:jc w:val="center"/>
+            </w:pPr>
+            <w:r>
+              <w:rPr>
+                <w:rFonts w:ascii="Calibri" w:cs="Calibri" w:eastAsia="Calibri" w:hAnsi="Calibri"/>
+                <w:b w:val="false"/>
+                <w:bCs w:val="false"/>
+                <w:color w:val="000000"/>
+                <w:sz w:val="20"/>
+                <w:szCs w:val="20"/>
+              </w:rPr>
+              <w:t xml:space="preserve">0</w:t>
+            </w:r>
+          </w:p>
+        </w:tc>
+        <w:tc>
+          <w:tcPr>
+            <w:tcW w:type="dxa" w:w="1780"/>
+            <w:tcBorders>
+              <w:top w:val="single" w:color="BFBFBF" w:sz="2"/>
+              <w:left w:val="single" w:color="BFBFBF" w:sz="2"/>
+              <w:bottom w:val="single" w:color="BFBFBF" w:sz="2"/>
+              <w:right w:val="single" w:color="BFBFBF" w:sz="2"/>
+            </w:tcBorders>
+            <w:tcMar>
+              <w:top w:type="dxa" w:w="60"/>
+              <w:left w:type="dxa" w:w="100"/>
+              <w:bottom w:type="dxa" w:w="60"/>
+              <w:right w:type="dxa" w:w="100"/>
+            </w:tcMar>
+            <w:vAlign w:val="center"/>
+          </w:tcPr>
+          <w:p>
+            <w:pPr>
+              <w:jc w:val="center"/>
+            </w:pPr>
+            <w:r>
+              <w:rPr>
+                <w:rFonts w:ascii="Calibri" w:cs="Calibri" w:eastAsia="Calibri" w:hAnsi="Calibri"/>
+                <w:b w:val="false"/>
+                <w:bCs w:val="false"/>
+                <w:color w:val="000000"/>
+                <w:sz w:val="20"/>
+                <w:szCs w:val="20"/>
+              </w:rPr>
+              <w:t xml:space="preserve">43</w:t>
+            </w:r>
+          </w:p>
+        </w:tc>
+      </w:tr>
+      <w:tr>
+        <w:tc>
+          <w:tcPr>
+            <w:tcW w:type="dxa" w:w="2600"/>
+            <w:tcBorders>
+              <w:top w:val="single" w:color="BFBFBF" w:sz="2"/>
+              <w:left w:val="single" w:color="BFBFBF" w:sz="2"/>
+              <w:bottom w:val="single" w:color="BFBFBF" w:sz="2"/>
+              <w:right w:val="single" w:color="BFBFBF" w:sz="2"/>
+            </w:tcBorders>
+            <w:tcMar>
+              <w:top w:type="dxa" w:w="60"/>
+              <w:left w:type="dxa" w:w="100"/>
+              <w:bottom w:type="dxa" w:w="60"/>
+              <w:right w:type="dxa" w:w="100"/>
+            </w:tcMar>
+            <w:vAlign w:val="center"/>
+          </w:tcPr>
+          <w:p>
+            <w:pPr>
+              <w:jc w:val="left"/>
+            </w:pPr>
+            <w:r>
+              <w:rPr>
+                <w:rFonts w:ascii="Calibri" w:cs="Calibri" w:eastAsia="Calibri" w:hAnsi="Calibri"/>
+                <w:b w:val="false"/>
+                <w:bCs w:val="false"/>
+                <w:color w:val="000000"/>
+                <w:sz w:val="20"/>
+                <w:szCs w:val="20"/>
+              </w:rPr>
+              <w:t xml:space="preserve">Partido de nicho</w:t>
+            </w:r>
+          </w:p>
+        </w:tc>
+        <w:tc>
+          <w:tcPr>
+            <w:tcW w:type="dxa" w:w="1000"/>
+            <w:tcBorders>
+              <w:top w:val="single" w:color="BFBFBF" w:sz="2"/>
+              <w:left w:val="single" w:color="BFBFBF" w:sz="2"/>
+              <w:bottom w:val="single" w:color="BFBFBF" w:sz="2"/>
+              <w:right w:val="single" w:color="BFBFBF" w:sz="2"/>
+            </w:tcBorders>
+            <w:tcMar>
+              <w:top w:type="dxa" w:w="60"/>
+              <w:left w:type="dxa" w:w="100"/>
+              <w:bottom w:type="dxa" w:w="60"/>
+              <w:right w:type="dxa" w:w="100"/>
+            </w:tcMar>
+            <w:vAlign w:val="center"/>
+          </w:tcPr>
+          <w:p>
+            <w:pPr>
+              <w:jc w:val="center"/>
+            </w:pPr>
+            <w:r>
+              <w:rPr>
+                <w:rFonts w:ascii="Calibri" w:cs="Calibri" w:eastAsia="Calibri" w:hAnsi="Calibri"/>
+                <w:b w:val="false"/>
+                <w:bCs w:val="false"/>
+                <w:color w:val="000000"/>
+                <w:sz w:val="20"/>
+                <w:szCs w:val="20"/>
+              </w:rPr>
+              <w:t xml:space="preserve">198</w:t>
+            </w:r>
+          </w:p>
+        </w:tc>
+        <w:tc>
+          <w:tcPr>
+            <w:tcW w:type="dxa" w:w="2000"/>
+            <w:tcBorders>
+              <w:top w:val="single" w:color="BFBFBF" w:sz="2"/>
+              <w:left w:val="single" w:color="BFBFBF" w:sz="2"/>
+              <w:bottom w:val="single" w:color="BFBFBF" w:sz="2"/>
+              <w:right w:val="single" w:color="BFBFBF" w:sz="2"/>
+            </w:tcBorders>
+            <w:tcMar>
+              <w:top w:type="dxa" w:w="60"/>
+              <w:left w:type="dxa" w:w="100"/>
+              <w:bottom w:type="dxa" w:w="60"/>
+              <w:right w:type="dxa" w:w="100"/>
+            </w:tcMar>
+            <w:vAlign w:val="center"/>
+          </w:tcPr>
+          <w:p>
+            <w:pPr>
+              <w:jc w:val="center"/>
+            </w:pPr>
+            <w:r>
+              <w:rPr>
+                <w:rFonts w:ascii="Calibri" w:cs="Calibri" w:eastAsia="Calibri" w:hAnsi="Calibri"/>
+                <w:b w:val="false"/>
+                <w:bCs w:val="false"/>
+                <w:color w:val="000000"/>
+                <w:sz w:val="20"/>
+                <w:szCs w:val="20"/>
+              </w:rPr>
+              <w:t xml:space="preserve">0.8</w:t>
+            </w:r>
+          </w:p>
+        </w:tc>
+        <w:tc>
+          <w:tcPr>
+            <w:tcW w:type="dxa" w:w="1980"/>
+            <w:tcBorders>
+              <w:top w:val="single" w:color="BFBFBF" w:sz="2"/>
+              <w:left w:val="single" w:color="BFBFBF" w:sz="2"/>
+              <w:bottom w:val="single" w:color="BFBFBF" w:sz="2"/>
+              <w:right w:val="single" w:color="BFBFBF" w:sz="2"/>
+            </w:tcBorders>
+            <w:tcMar>
+              <w:top w:type="dxa" w:w="60"/>
+              <w:left w:type="dxa" w:w="100"/>
+              <w:bottom w:type="dxa" w:w="60"/>
+              <w:right w:type="dxa" w:w="100"/>
+            </w:tcMar>
+            <w:vAlign w:val="center"/>
+          </w:tcPr>
+          <w:p>
+            <w:pPr>
+              <w:jc w:val="center"/>
+            </w:pPr>
+            <w:r>
+              <w:rPr>
+                <w:rFonts w:ascii="Calibri" w:cs="Calibri" w:eastAsia="Calibri" w:hAnsi="Calibri"/>
+                <w:b w:val="false"/>
+                <w:bCs w:val="false"/>
+                <w:color w:val="000000"/>
+                <w:sz w:val="20"/>
+                <w:szCs w:val="20"/>
+              </w:rPr>
+              <w:t xml:space="preserve">0</w:t>
+            </w:r>
+          </w:p>
+        </w:tc>
+        <w:tc>
+          <w:tcPr>
+            <w:tcW w:type="dxa" w:w="1780"/>
+            <w:tcBorders>
+              <w:top w:val="single" w:color="BFBFBF" w:sz="2"/>
+              <w:left w:val="single" w:color="BFBFBF" w:sz="2"/>
+              <w:bottom w:val="single" w:color="BFBFBF" w:sz="2"/>
+              <w:right w:val="single" w:color="BFBFBF" w:sz="2"/>
+            </w:tcBorders>
+            <w:tcMar>
+              <w:top w:type="dxa" w:w="60"/>
+              <w:left w:type="dxa" w:w="100"/>
+              <w:bottom w:type="dxa" w:w="60"/>
+              <w:right w:type="dxa" w:w="100"/>
+            </w:tcMar>
+            <w:vAlign w:val="center"/>
+          </w:tcPr>
+          <w:p>
+            <w:pPr>
+              <w:jc w:val="center"/>
+            </w:pPr>
+            <w:r>
+              <w:rPr>
+                <w:rFonts w:ascii="Calibri" w:cs="Calibri" w:eastAsia="Calibri" w:hAnsi="Calibri"/>
+                <w:b w:val="false"/>
+                <w:bCs w:val="false"/>
+                <w:color w:val="000000"/>
+                <w:sz w:val="20"/>
+                <w:szCs w:val="20"/>
+              </w:rPr>
+              <w:t xml:space="preserve">25</w:t>
+            </w:r>
+          </w:p>
+        </w:tc>
+      </w:tr>
+      <w:tr>
+        <w:tc>
+          <w:tcPr>
+            <w:tcW w:type="dxa" w:w="2600"/>
+            <w:tcBorders>
+              <w:top w:val="single" w:color="BFBFBF" w:sz="2"/>
+              <w:left w:val="single" w:color="BFBFBF" w:sz="2"/>
+              <w:bottom w:val="single" w:color="BFBFBF" w:sz="2"/>
+              <w:right w:val="single" w:color="BFBFBF" w:sz="2"/>
+            </w:tcBorders>
+            <w:tcMar>
+              <w:top w:type="dxa" w:w="60"/>
+              <w:left w:type="dxa" w:w="100"/>
+              <w:bottom w:type="dxa" w:w="60"/>
+              <w:right w:type="dxa" w:w="100"/>
+            </w:tcMar>
+            <w:vAlign w:val="center"/>
+          </w:tcPr>
+          <w:p>
+            <w:pPr>
+              <w:jc w:val="left"/>
+            </w:pPr>
+            <w:r>
+              <w:rPr>
+                <w:rFonts w:ascii="Calibri" w:cs="Calibri" w:eastAsia="Calibri" w:hAnsi="Calibri"/>
+                <w:b w:val="false"/>
+                <w:bCs w:val="false"/>
+                <w:color w:val="000000"/>
+                <w:sz w:val="20"/>
+                <w:szCs w:val="20"/>
+              </w:rPr>
+              <w:t xml:space="preserve">Partido institucionalizado</w:t>
+            </w:r>
+          </w:p>
+        </w:tc>
+        <w:tc>
+          <w:tcPr>
+            <w:tcW w:type="dxa" w:w="1000"/>
+            <w:tcBorders>
+              <w:top w:val="single" w:color="BFBFBF" w:sz="2"/>
+              <w:left w:val="single" w:color="BFBFBF" w:sz="2"/>
+              <w:bottom w:val="single" w:color="BFBFBF" w:sz="2"/>
+              <w:right w:val="single" w:color="BFBFBF" w:sz="2"/>
+            </w:tcBorders>
+            <w:tcMar>
+              <w:top w:type="dxa" w:w="60"/>
+              <w:left w:type="dxa" w:w="100"/>
+              <w:bottom w:type="dxa" w:w="60"/>
+              <w:right w:type="dxa" w:w="100"/>
+            </w:tcMar>
+            <w:vAlign w:val="center"/>
+          </w:tcPr>
+          <w:p>
+            <w:pPr>
+              <w:jc w:val="center"/>
+            </w:pPr>
+            <w:r>
+              <w:rPr>
+                <w:rFonts w:ascii="Calibri" w:cs="Calibri" w:eastAsia="Calibri" w:hAnsi="Calibri"/>
+                <w:b w:val="false"/>
+                <w:bCs w:val="false"/>
+                <w:color w:val="000000"/>
+                <w:sz w:val="20"/>
+                <w:szCs w:val="20"/>
+              </w:rPr>
+              <w:t xml:space="preserve">103</w:t>
+            </w:r>
+          </w:p>
+        </w:tc>
+        <w:tc>
+          <w:tcPr>
+            <w:tcW w:type="dxa" w:w="2000"/>
+            <w:tcBorders>
+              <w:top w:val="single" w:color="BFBFBF" w:sz="2"/>
+              <w:left w:val="single" w:color="BFBFBF" w:sz="2"/>
+              <w:bottom w:val="single" w:color="BFBFBF" w:sz="2"/>
+              <w:right w:val="single" w:color="BFBFBF" w:sz="2"/>
+            </w:tcBorders>
+            <w:tcMar>
+              <w:top w:type="dxa" w:w="60"/>
+              <w:left w:type="dxa" w:w="100"/>
+              <w:bottom w:type="dxa" w:w="60"/>
+              <w:right w:type="dxa" w:w="100"/>
+            </w:tcMar>
+            <w:vAlign w:val="center"/>
+          </w:tcPr>
+          <w:p>
+            <w:pPr>
+              <w:jc w:val="center"/>
+            </w:pPr>
+            <w:r>
+              <w:rPr>
+                <w:rFonts w:ascii="Calibri" w:cs="Calibri" w:eastAsia="Calibri" w:hAnsi="Calibri"/>
+                <w:b w:val="false"/>
+                <w:bCs w:val="false"/>
+                <w:color w:val="000000"/>
+                <w:sz w:val="20"/>
+                <w:szCs w:val="20"/>
+              </w:rPr>
+              <w:t xml:space="preserve">13.3</w:t>
+            </w:r>
+          </w:p>
+        </w:tc>
+        <w:tc>
+          <w:tcPr>
+            <w:tcW w:type="dxa" w:w="1980"/>
+            <w:tcBorders>
+              <w:top w:val="single" w:color="BFBFBF" w:sz="2"/>
+              <w:left w:val="single" w:color="BFBFBF" w:sz="2"/>
+              <w:bottom w:val="single" w:color="BFBFBF" w:sz="2"/>
+              <w:right w:val="single" w:color="BFBFBF" w:sz="2"/>
+            </w:tcBorders>
+            <w:tcMar>
+              <w:top w:type="dxa" w:w="60"/>
+              <w:left w:type="dxa" w:w="100"/>
+              <w:bottom w:type="dxa" w:w="60"/>
+              <w:right w:type="dxa" w:w="100"/>
+            </w:tcMar>
+            <w:vAlign w:val="center"/>
+          </w:tcPr>
+          <w:p>
+            <w:pPr>
+              <w:jc w:val="center"/>
+            </w:pPr>
+            <w:r>
+              <w:rPr>
+                <w:rFonts w:ascii="Calibri" w:cs="Calibri" w:eastAsia="Calibri" w:hAnsi="Calibri"/>
+                <w:b w:val="false"/>
+                <w:bCs w:val="false"/>
+                <w:color w:val="000000"/>
+                <w:sz w:val="20"/>
+                <w:szCs w:val="20"/>
+              </w:rPr>
+              <w:t xml:space="preserve">8</w:t>
+            </w:r>
+          </w:p>
+        </w:tc>
+        <w:tc>
+          <w:tcPr>
+            <w:tcW w:type="dxa" w:w="1780"/>
+            <w:tcBorders>
+              <w:top w:val="single" w:color="BFBFBF" w:sz="2"/>
+              <w:left w:val="single" w:color="BFBFBF" w:sz="2"/>
+              <w:bottom w:val="single" w:color="BFBFBF" w:sz="2"/>
+              <w:right w:val="single" w:color="BFBFBF" w:sz="2"/>
+            </w:tcBorders>
+            <w:tcMar>
+              <w:top w:type="dxa" w:w="60"/>
+              <w:left w:type="dxa" w:w="100"/>
+              <w:bottom w:type="dxa" w:w="60"/>
+              <w:right w:type="dxa" w:w="100"/>
+            </w:tcMar>
+            <w:vAlign w:val="center"/>
+          </w:tcPr>
+          <w:p>
+            <w:pPr>
+              <w:jc w:val="center"/>
+            </w:pPr>
+            <w:r>
+              <w:rPr>
+                <w:rFonts w:ascii="Calibri" w:cs="Calibri" w:eastAsia="Calibri" w:hAnsi="Calibri"/>
+                <w:b w:val="false"/>
+                <w:bCs w:val="false"/>
+                <w:color w:val="000000"/>
+                <w:sz w:val="20"/>
+                <w:szCs w:val="20"/>
+              </w:rPr>
+              <w:t xml:space="preserve">174</w:t>
+            </w:r>
+          </w:p>
+        </w:tc>
+      </w:tr>
+    </w:tbl>
+    <w:p>
+      <w:pPr>
+        <w:spacing w:after="160" w:line="276"/>
+      </w:pPr>
+      <w:r>
+        <w:rPr>
+          <w:rFonts w:ascii="Calibri" w:cs="Calibri" w:eastAsia="Calibri" w:hAnsi="Calibri"/>
+          <w:sz w:val="22"/>
+          <w:szCs w:val="22"/>
+        </w:rPr>
+        <w:t xml:space="preserve"/>
+      </w:r>
+    </w:p>
+    <w:p>
+      <w:pPr>
+        <w:spacing w:after="160" w:line="276"/>
+      </w:pPr>
+      <w:r>
+        <w:rPr>
+          <w:rFonts w:ascii="Calibri" w:cs="Calibri" w:eastAsia="Calibri" w:hAnsi="Calibri"/>
+          <w:sz w:val="22"/>
+          <w:szCs w:val="22"/>
+        </w:rPr>
+        <w:t xml:space="preserve">El contraste es contundente: la mitad de los partidos vehículo y de nicho desaparecen en el mismo año en que se registran (longevidad mediana = 0), mientras que los partidos institucionalizados sobreviven, en promedio, 13,3 años —con el Partido Liberal y el Partido Conservador, fundados en 1848 y 1849 y aún vigentes en 2022, marcando el máximo de 174 años—. Esta brecha de longevidad, obtenida con una variable que no participó en el clustering, confirma empíricamente que institucionalización (más que ideología) es el eje que mejor distingue a los partidos colombianos, y respalda usar esa noción, en vez de una etiqueta puramente descriptiva, para nombrar los perfiles de este reporte.</w:t>
       </w:r>
     </w:p>
     <w:p>
@@ -6688,7 +7558,7 @@
           <w:sz w:val="22"/>
           <w:szCs w:val="22"/>
         </w:rPr>
-        <w:t xml:space="preserve">El hallazgo central para política pública es cuantitativo: de las 5.143 organizaciones políticas registradas históricamente en Colombia, solo 93 (1.8%) funcionan como maquinarias electorales multinivel; el 98.2% restante opera en un solo nivel de gobierno o de forma marginal. El análisis de segundo nivel (sección 5.4), que usa votos reales en vez de participación binaria y excluye las coaliciones ad hoc, corrobora este patrón con otra fuente de datos: solo el 4,8% de los partidos genuinos (no-coalición) —el cluster “Élite nacional”, que incluye al Liberal, Conservador, Cambio Radical, Polo y Alianza Verde— concentra el grueso del respaldo electoral real, mientras el 86% son vehículos con votación marginal.</w:t>
+        <w:t xml:space="preserve">El hallazgo central para política pública es cuantitativo: de las 5.143 organizaciones políticas registradas históricamente en Colombia, solo 93 (1.8%) funcionan como maquinarias electorales multinivel; el 98.2% restante opera en un solo nivel de gobierno o de forma marginal. El análisis de segundo nivel (sección 5.4), que usa votos reales en vez de participación binaria y excluye las coaliciones ad hoc, corrobora este patrón con otra fuente de datos: solo el 4,8% de los partidos genuinos (no-coalición) —el cluster “Partido institucionalizado”, que incluye al Liberal, Conservador, Cambio Radical, Polo y Alianza Verde— concentra el grueso del respaldo electoral real, mientras el 86% son vehículos con votación marginal.</w:t>
       </w:r>
     </w:p>
     <w:p>
@@ -6942,7 +7812,7 @@
                 <w:sz w:val="20"/>
                 <w:szCs w:val="20"/>
               </w:rPr>
-              <w:t xml:space="preserve">% Élite nacional</w:t>
+              <w:t xml:space="preserve">% Institucionalizado</w:t>
             </w:r>
           </w:p>
         </w:tc>
@@ -7012,7 +7882,7 @@
                 <w:sz w:val="20"/>
                 <w:szCs w:val="20"/>
               </w:rPr>
-              <w:t xml:space="preserve">% Vehículo marginal</w:t>
+              <w:t xml:space="preserve">% Vehículo</w:t>
             </w:r>
           </w:p>
         </w:tc>
@@ -7729,7 +8599,7 @@
           <w:sz w:val="22"/>
           <w:szCs w:val="22"/>
         </w:rPr>
-        <w:t xml:space="preserve">El patrón es contrario al objetivo declarado de las reformas: el número de partidos nuevos se disparó después de cada reforma (de 395 en 2003–2011 a 1.097 en 2011–2023, un periodo más corto), mientras la probabilidad de que un partido nuevo alcance el nivel “Élite nacional” cayó de 14,4% (1991–2003) a apenas 1,2% (2011–2023). En otras palabras, ni el umbral de 2003 ni la Ley 1475 de 2011 frenaron la creación de vehículos electorales marginales; si acaso, coincidieron con una aceleración de su proliferación, mientras que alcanzar peso electoral real se volvió progresivamente más difícil para los partidos nuevos frente a la ventaja consolidada de las organizaciones históricas (Liberal, Conservador y similares, ya asentadas desde antes de estas reformas).</w:t>
+        <w:t xml:space="preserve">El patrón es contrario al objetivo declarado de las reformas: el número de partidos nuevos se disparó después de cada reforma (de 395 en 2003–2011 a 1.097 en 2011–2023, un periodo más corto), mientras la probabilidad de que un partido nuevo alcance el nivel “Partido institucionalizado” cayó de 14,4% (1991–2003) a apenas 1,2% (2011–2023). En otras palabras, ni el umbral de 2003 ni la Ley 1475 de 2011 frenaron la creación de vehículos electorales marginales; si acaso, coincidieron con una aceleración de su proliferación, mientras que alcanzar peso electoral real se volvió progresivamente más difícil para los partidos nuevos frente a la ventaja consolidada de las organizaciones históricas (Liberal, Conservador y similares, ya asentadas desde antes de estas reformas).</w:t>
       </w:r>
     </w:p>
     <w:p>
@@ -7936,7 +8806,7 @@
           <w:sz w:val="22"/>
           <w:szCs w:val="22"/>
         </w:rPr>
-        <w:t xml:space="preserve">Cobertura del cruce con votos reales (sección 5.4): el emparejamiento de nombres entre los archivos electorales y partidos.xlsx capturó el 80,6% de los votos históricos no-coalición; el 19,4% restante (sobre todo variantes con eslóganes propios) queda sin votos registrados, lo que puede subestimar levemente el peso electoral de algunos partidos en el cluster “Élite nacional” o “Nicho”. Además, las 2.988 filas de coaliciones ad hoc (58% de la base) quedaron fuera de este análisis por no ser atribuibles a un partido individual sin una regla de reparto arbitraria.</w:t>
+        <w:t xml:space="preserve">Cobertura del cruce con votos reales (sección 5.4): el emparejamiento de nombres entre los archivos electorales y partidos.xlsx capturó el 80,6% de los votos históricos no-coalición; el 19,4% restante (sobre todo variantes con eslóganes propios) queda sin votos registrados, lo que puede subestimar levemente el peso electoral de algunos partidos en el cluster “Partido institucionalizado” o “Nicho”. Además, las 2.988 filas de coaliciones ad hoc (58% de la base) quedaron fuera de este análisis por no ser atribuibles a un partido individual sin una regla de reparto arbitraria.</w:t>
       </w:r>
     </w:p>
     <w:p>
@@ -7991,6 +8861,92 @@
           <w:szCs w:val="22"/>
         </w:rPr>
         <w:t xml:space="preserve">Consideraciones éticas: clasificar automáticamente partidos como “vehículos marginales” podría malinterpretarse como un juicio de legitimidad política. Esta tipología debe usarse como insumo descriptivo para el diseño de reglas generales (umbrales, financiación), y no como criterio automático para negar o cancelar personería jurídica a organizaciones específicas, decisión que debe basarse en el debido proceso legal vigente.</w:t>
+      </w:r>
+    </w:p>
+    <w:p>
+      <w:pPr>
+        <w:pStyle w:val="Heading1"/>
+      </w:pPr>
+      <w:r>
+        <w:t xml:space="preserve">Referencias</w:t>
+      </w:r>
+    </w:p>
+    <w:p>
+      <w:pPr>
+        <w:spacing w:after="160" w:line="276"/>
+      </w:pPr>
+      <w:r>
+        <w:rPr>
+          <w:rFonts w:ascii="Calibri" w:cs="Calibri" w:eastAsia="Calibri" w:hAnsi="Calibri"/>
+          <w:sz w:val="22"/>
+          <w:szCs w:val="22"/>
+        </w:rPr>
+        <w:t xml:space="preserve">Jones, M. P., &amp; Mainwaring, S. (2003). The nationalization of parties and party systems: An empirical measure and an application to the Americas. Party Politics, 9(2), 139–166.</w:t>
+      </w:r>
+    </w:p>
+    <w:p>
+      <w:pPr>
+        <w:spacing w:after="160" w:line="276"/>
+      </w:pPr>
+      <w:r>
+        <w:rPr>
+          <w:rFonts w:ascii="Calibri" w:cs="Calibri" w:eastAsia="Calibri" w:hAnsi="Calibri"/>
+          <w:sz w:val="22"/>
+          <w:szCs w:val="22"/>
+        </w:rPr>
+        <w:t xml:space="preserve">Mainwaring, S., &amp; Scully, T. R. (Eds.). (1995). Building Democratic Institutions: Party Systems in Latin America. Stanford University Press.</w:t>
+      </w:r>
+    </w:p>
+    <w:p>
+      <w:pPr>
+        <w:spacing w:after="160" w:line="276"/>
+      </w:pPr>
+      <w:r>
+        <w:rPr>
+          <w:rFonts w:ascii="Calibri" w:cs="Calibri" w:eastAsia="Calibri" w:hAnsi="Calibri"/>
+          <w:sz w:val="22"/>
+          <w:szCs w:val="22"/>
+        </w:rPr>
+        <w:t xml:space="preserve">Meguid, B. M. (2005). Competition between unequals: The role of mainstream party strategy in niche party success. American Political Science Review, 99(3), 347–359.</w:t>
+      </w:r>
+    </w:p>
+    <w:p>
+      <w:pPr>
+        <w:spacing w:after="160" w:line="276"/>
+      </w:pPr>
+      <w:r>
+        <w:rPr>
+          <w:rFonts w:ascii="Calibri" w:cs="Calibri" w:eastAsia="Calibri" w:hAnsi="Calibri"/>
+          <w:sz w:val="22"/>
+          <w:szCs w:val="22"/>
+        </w:rPr>
+        <w:t xml:space="preserve">Panebianco, A. (1988). Political Parties: Organization and Power. Cambridge University Press.</w:t>
+      </w:r>
+    </w:p>
+    <w:p>
+      <w:pPr>
+        <w:spacing w:after="160" w:line="276"/>
+      </w:pPr>
+      <w:r>
+        <w:rPr>
+          <w:rFonts w:ascii="Calibri" w:cs="Calibri" w:eastAsia="Calibri" w:hAnsi="Calibri"/>
+          <w:sz w:val="22"/>
+          <w:szCs w:val="22"/>
+        </w:rPr>
+        <w:t xml:space="preserve">Pizarro Leongómez, E. (2006). Giants with feet of clay: political parties in Colombia. En Party Politics in the Andes. Rowman &amp; Littlefield.</w:t>
+      </w:r>
+    </w:p>
+    <w:p>
+      <w:pPr>
+        <w:spacing w:after="160" w:line="276"/>
+      </w:pPr>
+      <w:r>
+        <w:rPr>
+          <w:rFonts w:ascii="Calibri" w:cs="Calibri" w:eastAsia="Calibri" w:hAnsi="Calibri"/>
+          <w:sz w:val="22"/>
+          <w:szCs w:val="22"/>
+        </w:rPr>
+        <w:t xml:space="preserve">CEDE, Universidad de los Andes. Clasificación de partidos y movimientos políticos colombianos (1848–2022); Registraduría Nacional del Estado Civil / CEDE, resultados electorales históricos (1958–2023).</w:t>
       </w:r>
     </w:p>
     <w:sectPr>

</xml_diff>

<commit_message>
Agrega proyeccion t-SNE como complemento no lineal a la PCA
Cubierta en la sesion de aprendizaje no supervisado del curso.
UMAP fallo al inicializar por la enorme cantidad de perfiles
categoricos identicos entre partidos (grafo de vecinos
desconectado); t-SNE si produjo una proyeccion estable que
revela subestructura mas fina que la PCA lineal. Se agrega el
script reproducible (05_1_TSNE.R) y se documenta en el reporte.
</commit_message>
<xml_diff>
--- a/reporte/Reporte_Final_Partidos_Politicos.docx
+++ b/reporte/Reporte_Final_Partidos_Politicos.docx
@@ -3463,6 +3463,94 @@
     </w:p>
     <w:p>
       <w:pPr>
+        <w:spacing w:after="160" w:line="276"/>
+      </w:pPr>
+      <w:r>
+        <w:rPr>
+          <w:rFonts w:ascii="Calibri" w:cs="Calibri" w:eastAsia="Calibri" w:hAnsi="Calibri"/>
+          <w:sz w:val="22"/>
+          <w:szCs w:val="22"/>
+        </w:rPr>
+        <w:t xml:space="preserve">Como complemento, se proyectaron los mismos datos con t-SNE, una técnica no lineal que preserva la vecindad local mejor que una proyección lineal como PCA (cubierta en la sesión de aprendizaje no supervisado del curso). A diferencia de UMAP, que falló en inicializarse por la enorme cantidad de perfiles categóricos idénticos o casi idénticos entre partidos, t-SNE sí produjo una proyección estable.</w:t>
+      </w:r>
+    </w:p>
+    <w:p>
+      <w:pPr>
+        <w:spacing w:after="60" w:before="120"/>
+        <w:jc w:val="center"/>
+      </w:pPr>
+      <w:r>
+        <w:drawing>
+          <wp:inline distT="0" distB="0" distL="0" distR="0">
+            <wp:extent cx="4762500" cy="3305175"/>
+            <wp:effectExtent t="0" r="0" b="0" l="0"/>
+            <wp:docPr id="1" name="Figura 3. Proyección t-SNE de los 4 clusters (nivel 1). Cada mancha compacta refleja un perfil categórico exacto compartido por muchos partidos; la cercanía local es informativa, pero —siguiendo la guía del curso— el tamaño y la distancia entre manchas no debe interpretarse literalmente." descr="Figura 3. Proyección t-SNE de los 4 clusters (nivel 1). Cada mancha compacta refleja un perfil categórico exacto compartido por muchos partidos; la cercanía local es informativa, pero —siguiendo la guía del curso— el tamaño y la distancia entre manchas no debe interpretarse literalmente." title="Figura 3. Proyección t-SNE de los 4 clusters (nivel 1). Cada mancha compacta refleja un perfil categórico exacto compartido por muchos partidos; la cercanía local es informativa, pero —siguiendo la guía del curso— el tamaño y la distancia entre manchas no debe interpretarse literalmente."/>
+            <wp:cNvGraphicFramePr>
+              <a:graphicFrameLocks xmlns:a="http://schemas.openxmlformats.org/drawingml/2006/main" noChangeAspect="1"/>
+            </wp:cNvGraphicFramePr>
+            <a:graphic xmlns:a="http://schemas.openxmlformats.org/drawingml/2006/main">
+              <a:graphicData uri="http://schemas.openxmlformats.org/drawingml/2006/picture">
+                <pic:pic xmlns:pic="http://schemas.openxmlformats.org/drawingml/2006/picture">
+                  <pic:nvPicPr>
+                    <pic:cNvPr id="0" name="" descr=""/>
+                    <pic:cNvPicPr>
+                      <a:picLocks noChangeAspect="1" noChangeArrowheads="1"/>
+                    </pic:cNvPicPr>
+                  </pic:nvPicPr>
+                  <pic:blipFill>
+                    <a:blip r:embed="rId11" cstate="none"/>
+                    <a:srcRect/>
+                    <a:stretch>
+                      <a:fillRect/>
+                    </a:stretch>
+                  </pic:blipFill>
+                  <pic:spPr bwMode="auto">
+                    <a:xfrm>
+                      <a:off x="0" y="0"/>
+                      <a:ext cx="4762500" cy="3305175"/>
+                    </a:xfrm>
+                    <a:prstGeom prst="rect">
+                      <a:avLst/>
+                    </a:prstGeom>
+                  </pic:spPr>
+                </pic:pic>
+              </a:graphicData>
+            </a:graphic>
+          </wp:inline>
+        </w:drawing>
+      </w:r>
+    </w:p>
+    <w:p>
+      <w:pPr>
+        <w:spacing w:after="200"/>
+        <w:jc w:val="center"/>
+      </w:pPr>
+      <w:r>
+        <w:rPr>
+          <w:rFonts w:ascii="Calibri" w:cs="Calibri" w:eastAsia="Calibri" w:hAnsi="Calibri"/>
+          <w:i/>
+          <w:iCs/>
+          <w:sz w:val="18"/>
+          <w:szCs w:val="18"/>
+        </w:rPr>
+        <w:t xml:space="preserve">Figura 3. Proyección t-SNE de los 4 clusters (nivel 1). Cada mancha compacta refleja un perfil categórico exacto compartido por muchos partidos; la cercanía local es informativa, pero —siguiendo la guía del curso— el tamaño y la distancia entre manchas no debe interpretarse literalmente.</w:t>
+      </w:r>
+    </w:p>
+    <w:p>
+      <w:pPr>
+        <w:spacing w:after="160" w:line="276"/>
+      </w:pPr>
+      <w:r>
+        <w:rPr>
+          <w:rFonts w:ascii="Calibri" w:cs="Calibri" w:eastAsia="Calibri" w:hAnsi="Calibri"/>
+          <w:sz w:val="22"/>
+          <w:szCs w:val="22"/>
+        </w:rPr>
+        <w:t xml:space="preserve">La proyección revela una estructura más fina de la que sugiere el PCA lineal: los datos forman decenas de manchas compactas y bien separadas (cada una, un perfil categórico exacto repetido por muchos partidos), y los 4 clusters de K-Means no siempre coinciden con esas manchas de forma perfecta —el cluster 1 agrupa varias manchas distintas bajo una misma etiqueta—, mientras que el cluster 4 (“maquinarias electorales multinivel”, el más pequeño) aparece como su propio grupo compacto y separado, lo que respalda su interpretación como un perfil sustantivamente distinto y no como un artefacto del algoritmo.</w:t>
+      </w:r>
+    </w:p>
+    <w:p>
+      <w:pPr>
         <w:pStyle w:val="Heading2"/>
       </w:pPr>
       <w:r>
@@ -6619,7 +6707,7 @@
           <wp:inline distT="0" distB="0" distL="0" distR="0">
             <wp:extent cx="4953000" cy="3305175"/>
             <wp:effectExtent t="0" r="0" b="0" l="0"/>
-            <wp:docPr id="1" name="Figura 3. Segundo nivel: clusters de partidos no-coalición usando votos electorales reales (1958-2023), proyectados sobre las dos primeras componentes principales." descr="Figura 3. Segundo nivel: clusters de partidos no-coalición usando votos electorales reales (1958-2023), proyectados sobre las dos primeras componentes principales." title="Figura 3. Segundo nivel: clusters de partidos no-coalición usando votos electorales reales (1958-2023), proyectados sobre las dos primeras componentes principales."/>
+            <wp:docPr id="1" name="Figura 4. Segundo nivel: clusters de partidos no-coalición usando votos electorales reales (1958-2023), proyectados sobre las dos primeras componentes principales." descr="Figura 4. Segundo nivel: clusters de partidos no-coalición usando votos electorales reales (1958-2023), proyectados sobre las dos primeras componentes principales." title="Figura 4. Segundo nivel: clusters de partidos no-coalición usando votos electorales reales (1958-2023), proyectados sobre las dos primeras componentes principales."/>
             <wp:cNvGraphicFramePr>
               <a:graphicFrameLocks xmlns:a="http://schemas.openxmlformats.org/drawingml/2006/main" noChangeAspect="1"/>
             </wp:cNvGraphicFramePr>
@@ -6633,7 +6721,7 @@
                     </pic:cNvPicPr>
                   </pic:nvPicPr>
                   <pic:blipFill>
-                    <a:blip r:embed="rId11" cstate="none"/>
+                    <a:blip r:embed="rId12" cstate="none"/>
                     <a:srcRect/>
                     <a:stretch>
                       <a:fillRect/>
@@ -6668,7 +6756,7 @@
           <w:sz w:val="18"/>
           <w:szCs w:val="18"/>
         </w:rPr>
-        <w:t xml:space="preserve">Figura 3. Segundo nivel: clusters de partidos no-coalición usando votos electorales reales (1958-2023), proyectados sobre las dos primeras componentes principales.</w:t>
+        <w:t xml:space="preserve">Figura 4. Segundo nivel: clusters de partidos no-coalición usando votos electorales reales (1958-2023), proyectados sobre las dos primeras componentes principales.</w:t>
       </w:r>
     </w:p>
     <w:p>

</xml_diff>

<commit_message>
Actualiza titulo y pregunta de investigacion del reporte
Titulo: "Mas alla de la ideologia" / "Tipologias empiricas de los
partidos y movimientos politicos colombianos". Pregunta de
investigacion reescrita con enfoque neutro en tipologias empiricas
a partir de caracteristicas organizativas, electorales e ideologicas.
</commit_message>
<xml_diff>
--- a/reporte/Reporte_Final_Partidos_Politicos.docx
+++ b/reporte/Reporte_Final_Partidos_Politicos.docx
@@ -16,7 +16,7 @@
           <w:sz w:val="40"/>
           <w:szCs w:val="40"/>
         </w:rPr>
-        <w:t xml:space="preserve">¿Maquinarias electorales o vehículos de garaje?</w:t>
+        <w:t xml:space="preserve">Más allá de la ideología</w:t>
       </w:r>
     </w:p>
     <w:p>
@@ -31,7 +31,7 @@
           <w:sz w:val="28"/>
           <w:szCs w:val="28"/>
         </w:rPr>
-        <w:t xml:space="preserve">Perfiles de los partidos y movimientos políticos colombianos: una tipología basada en K-Means</w:t>
+        <w:t xml:space="preserve">Tipologías empíricas de los partidos y movimientos políticos colombianos</w:t>
       </w:r>
     </w:p>
     <w:p>
@@ -199,7 +199,7 @@
           <w:sz w:val="22"/>
           <w:szCs w:val="22"/>
         </w:rPr>
-        <w:t xml:space="preserve">¿Por qué la clasificación ideológica no logra explicar el éxito electoral de los partidos colombianos, y qué tipología alternativa —basada en institucionalización organizativa y nacionalización electoral— distingue a las organizaciones realmente consolidadas de los vehículos electorales efímeros?</w:t>
+        <w:t xml:space="preserve">¿Qué tipologías empíricas de partidos políticos colombianos emergen del análisis conjunto de sus características organizativas, electorales e ideológicas, y qué revelan sobre la estructura del sistema de partidos?</w:t>
       </w:r>
     </w:p>
     <w:p>

</xml_diff>

<commit_message>
Agrega reconocimiento a Claude en la portada del reporte
</commit_message>
<xml_diff>
--- a/reporte/Reporte_Final_Partidos_Politicos.docx
+++ b/reporte/Reporte_Final_Partidos_Politicos.docx
@@ -109,6 +109,23 @@
           <w:szCs w:val="19"/>
         </w:rPr>
         <w:t xml:space="preserve">Data: Cabra-Ruíz, Torres, Wills-Otero &amp; Castilla-Gutiérrez (2023); Torres, Barinas-Forero, Forero-Mesa, Sánchez &amp; Tibavisco (2023). Centro de Estudios sobre Desarrollo Económico (CEDE), Universidad de los Andes.</w:t>
+      </w:r>
+    </w:p>
+    <w:p>
+      <w:pPr>
+        <w:spacing w:before="120"/>
+        <w:jc w:val="center"/>
+      </w:pPr>
+      <w:r>
+        <w:rPr>
+          <w:rFonts w:ascii="Calibri" w:cs="Calibri" w:eastAsia="Calibri" w:hAnsi="Calibri"/>
+          <w:i/>
+          <w:iCs/>
+          <w:color w:val="808080"/>
+          <w:sz w:val="17"/>
+          <w:szCs w:val="17"/>
+        </w:rPr>
+        <w:t xml:space="preserve">Desarrollado con el apoyo de Claude (Claude Code, Anthropic) como asistente de análisis y redacción.</w:t>
       </w:r>
     </w:p>
     <w:p>

</xml_diff>

<commit_message>
Estandariza nombres de clusters y aclara algoritmo vs. interpretacion
- Pregunta de investigacion consolidada en una sola pregunta, con el
  periodo (1848-2023) explicito.
- Nombres de clusters unificados entre nivel 1 y nivel 2: elimina
  "maquinarias electorales" y "vehiculos" por categorias analiticas
  (institucionalizados y nacionalizados / no institucionalizados / de
  nicho / ideologicos locales), evitando atribuir al algoritmo
  caracteristicas que no mide directamente.
- Nueva aclaracion metodologica en la seccion 3: distingue lo que
  K-Means agrupa (patrones observados) de la interpretacion teorica
  posterior de esos clusters.
</commit_message>
<xml_diff>
--- a/reporte/Reporte_Final_Partidos_Politicos.docx
+++ b/reporte/Reporte_Final_Partidos_Politicos.docx
@@ -151,7 +151,7 @@
           <w:sz w:val="22"/>
           <w:szCs w:val="22"/>
         </w:rPr>
-        <w:t xml:space="preserve">Este reporte combina dos fuentes de datos (data) del Centro de Estudios sobre Desarrollo Económico (CEDE), Universidad de los Andes. La primera —Cabra-Ruíz, Torres, Wills-Otero &amp; Castilla-Gutiérrez (2023)— clasifica 5.143 partidos, movimientos y coaliciones políticas colombianas con variables de ideología, tradicionalidad, nacionalización, grupo representativo y participación electoral binaria en siete tipos de elección. Al revisarla se descubrió que el 58% de las filas (2.988) corresponden a coaliciones (variable coalicion=1), la mayoría de alcance local, aunque muchas son alianzas Liberal-Conservador para una sola alcaldía y no vehículos marginales.</w:t>
+        <w:t xml:space="preserve">Este reporte combina dos fuentes de datos (data) del Centro de Estudios sobre Desarrollo Económico (CEDE), Universidad de los Andes. La primera —Cabra-Ruíz, Torres, Wills-Otero &amp; Castilla-Gutiérrez (2023)— clasifica 5.143 partidos, movimientos y coaliciones políticas colombianas con variables de ideología, tradicionalidad, nacionalización, grupo representativo y participación electoral binaria en siete tipos de elección. Al revisarla se descubrió que el 58% de las filas (2.988) corresponden a coaliciones (variable coalicion=1), la mayoría de alcance local, aunque muchas son alianzas Liberal-Conservador para una sola alcaldía, no coaliciones entre movimientos marginales.</w:t>
       </w:r>
     </w:p>
     <w:p>
@@ -216,7 +216,7 @@
           <w:sz w:val="22"/>
           <w:szCs w:val="22"/>
         </w:rPr>
-        <w:t xml:space="preserve">¿Qué tipologías empíricas de partidos políticos colombianos emergen del análisis conjunto de sus características organizativas, electorales e ideológicas, y qué revelan sobre la estructura del sistema de partidos?</w:t>
+        <w:t xml:space="preserve">¿Qué tipologías empíricas de partidos y movimientos políticos colombianos, entre 1848 y 2023, emergen del análisis conjunto de sus características organizativas, electorales e ideológicas?</w:t>
       </w:r>
     </w:p>
     <w:p>
@@ -289,7 +289,7 @@
           <w:sz w:val="22"/>
           <w:szCs w:val="22"/>
         </w:rPr>
-        <w:t xml:space="preserve">Este reporte busca cuantificar sistemáticamente, sobre el universo completo de partidos alguna vez registrados, cuántos son organizaciones institucionalizadas y nacionalizadas y cuántos son vehículos efímeros. El hallazgo central —que menos del 2% está institucionalizado y nacionalizado— aporta evidencia directa al diseño de umbrales de personería jurídica, reglas de coalición y fórmulas de financiación estatal.</w:t>
+        <w:t xml:space="preserve">Este reporte busca cuantificar sistemáticamente, sobre el universo completo de partidos alguna vez registrados, cuántos son organizaciones institucionalizadas y nacionalizadas y cuántos son organizaciones no institucionalizadas de corta duración. El hallazgo central —que menos del 2% está institucionalizado y nacionalizado— aporta evidencia directa al diseño de umbrales de personería jurídica, reglas de coalición y fórmulas de financiación estatal.</w:t>
       </w:r>
     </w:p>
     <w:p>
@@ -378,6 +378,19 @@
           <w:szCs w:val="22"/>
         </w:rPr>
         <w:t xml:space="preserve">El PCA se usó únicamente como herramienta de visualización e interpretación de cargas, no como reducción de dimensionalidad previa al clustering (K-Means corrió sobre las variables dummy estandarizadas). Los grupos se validaron con pruebas χ² de independencia frente a cada variable original, con la V de Cramér como tamaño de efecto y corrección de Benjamini-Hochberg para el múltiple testing (12 pruebas).</w:t>
+      </w:r>
+    </w:p>
+    <w:p>
+      <w:pPr>
+        <w:spacing w:after="160" w:line="276"/>
+      </w:pPr>
+      <w:r>
+        <w:rPr>
+          <w:rFonts w:ascii="Calibri" w:cs="Calibri" w:eastAsia="Calibri" w:hAnsi="Calibri"/>
+          <w:sz w:val="22"/>
+          <w:szCs w:val="22"/>
+        </w:rPr>
+        <w:t xml:space="preserve">Conviene distinguir dos pasos que no deben confundirse: K-Means agrupa partidos únicamente a partir de patrones observados en los datos (participación electoral por nivel, tradicionalidad, grupo representativo); los nombres asignados a cada cluster (“institucionalizado”, “no institucionalizado”, “de nicho”) son una interpretación teórica posterior, apoyada en la literatura de la sección 2, no una medición directa del algoritmo. El modelo no mide institucionalización: descubre un patrón de longevidad y alcance multinivel que esa literatura permite nombrar así.</w:t>
       </w:r>
     </w:p>
     <w:p>
@@ -725,7 +738,7 @@
           <w:sz w:val="22"/>
           <w:szCs w:val="22"/>
         </w:rPr>
-        <w:t xml:space="preserve">Como complemento, se proyectaron los mismos datos con t-SNE, técnica no lineal que preserva mejor la vecindad local (cubierta en la sesión de no supervisado del curso). UMAP falló al inicializar por la enorme cantidad de perfiles categóricos idénticos entre partidos; t-SNE sí produjo una proyección estable (Figura 3), revelando decenas de manchas compactas —cada una, un perfil categórico exacto— que los 4 clusters de K-Means no siempre respetan (el cluster 3 agrupa varias bajo una etiqueta), mientras el cluster 1 (“maquinarias electorales multinivel”) aparece como su propio grupo compacto, respaldando que es un perfil sustantivo y no un artefacto del algoritmo.</w:t>
+        <w:t xml:space="preserve">Como complemento, se proyectaron los mismos datos con t-SNE, técnica no lineal que preserva mejor la vecindad local (cubierta en la sesión de no supervisado del curso). UMAP falló al inicializar por la enorme cantidad de perfiles categóricos idénticos entre partidos; t-SNE sí produjo una proyección estable (Figura 3), revelando decenas de manchas compactas —cada una, un perfil categórico exacto— que los 4 clusters de K-Means no siempre respetan (el cluster 3 agrupa varias bajo una etiqueta), mientras el cluster 1 (“partidos institucionalizados y nacionalizados”) aparece como su propio grupo compacto, respaldando que es un perfil sustantivo y no un artefacto del algoritmo.</w:t>
       </w:r>
     </w:p>
     <w:p>
@@ -845,7 +858,7 @@
           <w:sz w:val="22"/>
           <w:szCs w:val="22"/>
         </w:rPr>
-        <w:t xml:space="preserve">Los indicadores part_* son binarios, sin capturar la magnitud del respaldo electoral. Se incorporaron los resultados electorales históricos (Torres et al., 2023) para los mismos siete niveles, a nivel de candidato-municipio-elección. Al cruzarlos con la base de partidos se confirmó que el 58% de las 5.143 organizaciones (2.988 filas) son coaliciones, en su mayoría de alcance local —aunque el 71% está clasificado como gradonac=1 (“nacional”), y muchas son alianzas puntuales Liberal-Conservador, no vehículos marginales—.</w:t>
+        <w:t xml:space="preserve">Los indicadores part_* son binarios, sin capturar la magnitud del respaldo electoral. Se incorporaron los resultados electorales históricos (Torres et al., 2023) para los mismos siete niveles, a nivel de candidato-municipio-elección. Al cruzarlos con la base de partidos se confirmó que el 58% de las 5.143 organizaciones (2.988 filas) son coaliciones, en su mayoría de alcance local —aunque el 71% está clasificado como gradonac=1 (“nacional”), y muchas son alianzas puntuales Liberal-Conservador, no coaliciones entre movimientos marginales—.</w:t>
       </w:r>
     </w:p>
     <w:p>
@@ -932,7 +945,7 @@
           <w:sz w:val="22"/>
           <w:szCs w:val="22"/>
         </w:rPr>
-        <w:t xml:space="preserve">El patrón se sostiene en los siete niveles: “Partido institucionalizado” supera a “Partido vehículo” por un factor de 60 a 1.300 veces, sin depender de una sola elección. “Partido de nicho” se distingue por presencia relativamente alta en gobernación/presidencia frente a votación mínima en senado, coherente con partidos de representación de intereses específicos que rara vez compiten a nivel nacional.</w:t>
+        <w:t xml:space="preserve">El patrón se sostiene en los siete niveles: “Partido institucionalizado” supera a “Partido no institucionalizado” por un factor de 60 a 1.300 veces, sin depender de una sola elección. “Partido de nicho” se distingue por presencia relativamente alta en gobernación/presidencia frente a votación mínima en senado, coherente con partidos de representación de intereses específicos que rara vez compiten a nivel nacional.</w:t>
       </w:r>
     </w:p>
     <w:p>
@@ -1028,7 +1041,7 @@
           <w:sz w:val="22"/>
           <w:szCs w:val="22"/>
         </w:rPr>
-        <w:t xml:space="preserve">Si la institucionalización es la capacidad de sobrevivir en el tiempo más allá de la fundación (Panebianco, 1988; Mainwaring &amp; Scully, 1995), la longevidad de cada partido (años entre fundación y último registro, campo temporalidad) ofrece una prueba directa —independiente del clustering— de si los nombres del segundo nivel son adecuados (Tabla A10, Anexos). El contraste es contundente: la mitad de los partidos vehículo y de nicho desaparecen en el mismo año en que se registran (mediana = 0), mientras los institucionalizados sobreviven en promedio 13,3 años —Liberal y Conservador, fundados en 1848 y 1849 y vigentes en 2022, marcan el máximo de 174 años—. Esta brecha, obtenida con una variable que no participó en el clustering, confirma que institucionalización, más que ideología, es el eje que mejor distingue a los partidos colombianos.</w:t>
+        <w:t xml:space="preserve">Si la institucionalización es la capacidad de sobrevivir en el tiempo más allá de la fundación (Panebianco, 1988; Mainwaring &amp; Scully, 1995), la longevidad de cada partido (años entre fundación y último registro, campo temporalidad) ofrece una prueba directa —independiente del clustering— de si los nombres del segundo nivel son adecuados (Tabla A10, Anexos). El contraste es contundente: la mitad de los partidos no institucionalizados y de nicho desaparecen en el mismo año en que se registran (mediana = 0), mientras los institucionalizados sobreviven en promedio 13,3 años —Liberal y Conservador, fundados en 1848 y 1849 y vigentes en 2022, marcan el máximo de 174 años—. Esta brecha, obtenida con una variable que no participó en el clustering, confirma que institucionalización, más que ideología, es el eje que mejor distingue a los partidos colombianos.</w:t>
       </w:r>
     </w:p>
     <w:p>
@@ -1091,7 +1104,7 @@
           <w:sz w:val="22"/>
           <w:szCs w:val="22"/>
         </w:rPr>
-        <w:t xml:space="preserve">Cluster 1 — “Maquinarias electorales multinivel” (1.8%, n=93): el más pequeño y determinante. Participa en todos los niveles muy por encima del promedio (67.7% presidencia, 50.5% senado, 55.9% cámara), pero el 66.7% no tiene ideología clasificable — el éxito multinivel se asocia con menor perfil programático, consistente con un sistema más personalista/clientelar que doctrinario.</w:t>
+        <w:t xml:space="preserve">Cluster 1 — “Partidos institucionalizados y nacionalizados” (1.8%, n=93): el más pequeño y determinante. Participa en todos los niveles muy por encima del promedio (67.7% presidencia, 50.5% senado, 55.9% cámara), pero el 66.7% no tiene ideología clasificable — el éxito multinivel se asocia con menor perfil programático, consistente con un sistema más personalista/clientelar que doctrinario.</w:t>
       </w:r>
     </w:p>
     <w:p>
@@ -1109,7 +1122,7 @@
           <w:sz w:val="22"/>
           <w:szCs w:val="22"/>
         </w:rPr>
-        <w:t xml:space="preserve">Cluster 2 — “Vehículos sin identidad programática” (39.4%, n=2.024): el más grande. 99.6% sin ideología clasificable, casi nada tradicional (0.4%), participación dispersa sin patrón de consolidación.</w:t>
+        <w:t xml:space="preserve">Cluster 2 — “Partidos no institucionalizados” (39.4%, n=2.024): el más grande. 99.6% sin ideología clasificable, casi nada tradicional (0.4%), participación dispersa sin patrón de consolidación.</w:t>
       </w:r>
     </w:p>
     <w:p>
@@ -1127,7 +1140,7 @@
           <w:sz w:val="22"/>
           <w:szCs w:val="22"/>
         </w:rPr>
-        <w:t xml:space="preserve">Cluster 3 — “Partidos locales con identidad ideológica” (37.6%, n=1.931): ~100% con ideología clasificada (77.6% “ni derecha ni izquierda”), concentrado en alcaldías (73.6%), presencia nula en presidencia.</w:t>
+        <w:t xml:space="preserve">Cluster 3 — “Partidos ideológicos locales” (37.6%, n=1.931): ~100% con ideología clasificada (77.6% “ni derecha ni izquierda”), concentrado en alcaldías (73.6%), presencia nula en presidencia.</w:t>
       </w:r>
     </w:p>
     <w:p>
@@ -1158,7 +1171,7 @@
           <w:sz w:val="22"/>
           <w:szCs w:val="22"/>
         </w:rPr>
-        <w:t xml:space="preserve">El hallazgo central es cuantitativo: solo 93 partidos (1.8%) funcionan como maquinarias multinivel; el 98.2% restante opera en un solo nivel o de forma marginal. El segundo nivel (votos reales, sin coaliciones) corrobora el patrón: solo el 4,8% de los partidos genuinos —“Partido institucionalizado”, que incluye al Liberal, Conservador, Cambio Radical, Polo y Verde— concentra el grueso del respaldo electoral, mientras el 86% son vehículos con votación marginal.</w:t>
+        <w:t xml:space="preserve">El hallazgo central es cuantitativo: solo 93 partidos (1.8%) están institucionalizados y nacionalizados; el 98.2% restante opera en un solo nivel o de forma marginal. El segundo nivel (votos reales, sin coaliciones) corrobora el patrón: solo el 4,8% de los partidos genuinos —“Partido institucionalizado”, que incluye al Liberal, Conservador, Cambio Radical, Polo y Verde— concentra el grueso del respaldo electoral, mientras el 86% no está institucionalizado y tiene votación marginal.</w:t>
       </w:r>
     </w:p>
     <w:p>
@@ -1179,7 +1192,7 @@
           <w:sz w:val="22"/>
           <w:szCs w:val="22"/>
         </w:rPr>
-        <w:t xml:space="preserve">Si el problema es la proliferación de vehículos sin sustancia, la solución no puede seguir midiéndose con una sola elección: los datos muestran que casi cualquier partido supera un umbral de votación puntual, pero solo una élite de 93 organizaciones sostiene ese desempeño en varios niveles a la vez. De ahí se derivan cuatro implicaciones concretas:</w:t>
+        <w:t xml:space="preserve">Si el problema es la proliferación de organizaciones sin sustancia institucional, la solución no puede seguir midiéndose con una sola elección: los datos muestran que casi cualquier partido supera un umbral de votación puntual, pero solo una élite de 93 organizaciones sostiene ese desempeño en varios niveles a la vez. De ahí se derivan cuatro implicaciones concretas:</w:t>
       </w:r>
     </w:p>
     <w:p>
@@ -1215,7 +1228,7 @@
           <w:sz w:val="22"/>
           <w:szCs w:val="22"/>
         </w:rPr>
-        <w:t xml:space="preserve">La financiación estatal podría ponderarse por amplitud de participación (número de niveles), no solo votos totales, para desincentivar vehículos de un solo uso (cluster 2).</w:t>
+        <w:t xml:space="preserve">La financiación estatal podría ponderarse por amplitud de participación (número de niveles), no solo votos totales, para desincentivar organizaciones de un solo uso (cluster 2).</w:t>
       </w:r>
     </w:p>
     <w:p>
@@ -1251,7 +1264,7 @@
           <w:sz w:val="22"/>
           <w:szCs w:val="22"/>
         </w:rPr>
-        <w:t xml:space="preserve">La tipología puede usarse como insumo de monitoreo periódico: reclasificar la oferta partidista vigente permitiría a la Registraduría y al CNE medir si la proliferación de vehículos marginales aumenta o disminuye tras cada reforma.</w:t>
+        <w:t xml:space="preserve">La tipología puede usarse como insumo de monitoreo periódico: reclasificar la oferta partidista vigente permitiría a la Registraduría y al CNE medir si la proliferación de partidos no institucionalizados aumenta o disminuye tras cada reforma.</w:t>
       </w:r>
     </w:p>
     <w:p>
@@ -1285,7 +1298,7 @@
           <w:sz w:val="22"/>
           <w:szCs w:val="22"/>
         </w:rPr>
-        <w:t xml:space="preserve">Usando el año de fundación, se comparó la composición de los clusters del segundo nivel entre partidos no-coalición fundados en cuatro periodos delimitados por hitos de reforma: antes de 1991, 1991–2003, 2003–2011 (Acto Legislativo 01/2003, umbral electoral) y 2011–2023 (Ley 1475/2011, requisitos de personería) (Tabla A11, Anexos). El patrón es contrario al objetivo declarado: el número de partidos nuevos se disparó tras cada reforma (de 395 en 2003–2011 a 1.097 en 2011–2023, un periodo más corto), mientras la probabilidad de que un partido nuevo llegue a “institucionalizado” cayó de 14,4% a 1,2%. Ni el umbral de 2003 ni la Ley 1475 frenaron la creación de vehículos electorales; si acaso, coincidieron con una aceleración de su proliferación, mientras alcanzar peso real se volvió más difícil frente a la ventaja consolidada de organizaciones históricas (Liberal, Conservador). Esto refuerza la recomendación de exigir desempeño multinivel sostenido, no un umbral de votación puntual.</w:t>
+        <w:t xml:space="preserve">Usando el año de fundación, se comparó la composición de los clusters del segundo nivel entre partidos no-coalición fundados en cuatro periodos delimitados por hitos de reforma: antes de 1991, 1991–2003, 2003–2011 (Acto Legislativo 01/2003, umbral electoral) y 2011–2023 (Ley 1475/2011, requisitos de personería) (Tabla A11, Anexos). El patrón es contrario al objetivo declarado: el número de partidos nuevos se disparó tras cada reforma (de 395 en 2003–2011 a 1.097 en 2011–2023, un periodo más corto), mientras la probabilidad de que un partido nuevo llegue a “institucionalizado” cayó de 14,4% a 1,2%. Ni el umbral de 2003 ni la Ley 1475 frenaron la creación de partidos no institucionalizados; si acaso, coincidieron con una aceleración de su proliferación, mientras alcanzar peso real se volvió más difícil frente a la ventaja consolidada de organizaciones históricas (Liberal, Conservador). Esto refuerza la recomendación de exigir desempeño multinivel sostenido, no un umbral de votación puntual.</w:t>
       </w:r>
     </w:p>
     <w:p>
@@ -1518,7 +1531,7 @@
           <w:sz w:val="22"/>
           <w:szCs w:val="22"/>
         </w:rPr>
-        <w:t xml:space="preserve">Sensibilidad al método de agrupamiento: Kernel PCA y Spectral Clustering sobre una muestra de 2.000 partidos mostraron acuerdo moderado con K-Means (índice de Rand ajustado = 0,57): Spectral recupera bien el bloque local con ideología clasificada, pero no aísla el 1,8% de “maquinarias multinivel” — sensible al método, patrón robusto pero no una frontera exacta.</w:t>
+        <w:t xml:space="preserve">Sensibilidad al método de agrupamiento: Kernel PCA y Spectral Clustering sobre una muestra de 2.000 partidos mostraron acuerdo moderado con K-Means (índice de Rand ajustado = 0,57): Spectral recupera bien el bloque local con ideología clasificada, pero no aísla el 1,8% de partidos institucionalizados y nacionalizados — sensible al método, patrón robusto pero no una frontera exacta.</w:t>
       </w:r>
     </w:p>
     <w:p>
@@ -1536,7 +1549,7 @@
           <w:sz w:val="22"/>
           <w:szCs w:val="22"/>
         </w:rPr>
-        <w:t xml:space="preserve">Consideraciones éticas: clasificar partidos como “vehículos marginales” podría malinterpretarse como juicio de legitimidad política. Usar como insumo descriptivo para reglas generales, no como criterio automático de cancelación de personería jurídica.</w:t>
+        <w:t xml:space="preserve">Consideraciones éticas: clasificar partidos como “no institucionalizados” podría malinterpretarse como juicio de legitimidad política. Usar como insumo descriptivo para reglas generales, no como criterio automático de cancelación de personería jurídica.</w:t>
       </w:r>
     </w:p>
     <w:p>
@@ -10818,7 +10831,7 @@
                 <w:sz w:val="20"/>
                 <w:szCs w:val="20"/>
               </w:rPr>
-              <w:t xml:space="preserve">Partido vehículo</w:t>
+              <w:t xml:space="preserve">Partido no institucionalizado</w:t>
             </w:r>
           </w:p>
         </w:tc>
@@ -11676,7 +11689,7 @@
                 <w:sz w:val="20"/>
                 <w:szCs w:val="20"/>
               </w:rPr>
-              <w:t xml:space="preserve">Partido vehículo</w:t>
+              <w:t xml:space="preserve">Partido no institucionalizado</w:t>
             </w:r>
           </w:p>
         </w:tc>
@@ -12732,7 +12745,7 @@
                 <w:sz w:val="20"/>
                 <w:szCs w:val="20"/>
               </w:rPr>
-              <w:t xml:space="preserve">Partido vehículo</w:t>
+              <w:t xml:space="preserve">Partido no institucionalizado</w:t>
             </w:r>
           </w:p>
         </w:tc>
@@ -13446,7 +13459,7 @@
                 <w:sz w:val="20"/>
                 <w:szCs w:val="20"/>
               </w:rPr>
-              <w:t xml:space="preserve">% Vehículo</w:t>
+              <w:t xml:space="preserve">% No institucionalizado</w:t>
             </w:r>
           </w:p>
         </w:tc>

</xml_diff>

<commit_message>
Revisión de los reportes
</commit_message>
<xml_diff>
--- a/reporte/Reporte_Final_Partidos_Politicos.docx
+++ b/reporte/Reporte_Final_Partidos_Politicos.docx
@@ -250,7 +250,7 @@
           <w:sz w:val="22"/>
           <w:szCs w:val="22"/>
         </w:rPr>
-        <w:t xml:space="preserve">La ideología no es el eje que organiza al sistema de partidos colombiano: los datos lo desmienten. La forma más habitual de describir a un partido es por su etiqueta ideológica, pero cerca del 40% de los partidos no tiene ideología clasificable, y —de forma casi paradójica (sección 5.4)— los partidos electoralmente más exitosos son también los que con mayor frecuencia carecen de ella. Un marco que se apoye en la ideología está, entonces, construido sobre datos faltantes en la mitad de los casos que más importan.</w:t>
+        <w:t xml:space="preserve">La ideología no es el eje que organiza al sistema de partidos colombiano: los datos lo desmienten. La forma más habitual de describir a un partido es por su etiqueta ideológica, pero cerca del 40% de los partidos no tiene ideología clasificable, y esa ausencia no se concentra en los partidos marginales: la identidad ideológica bien definida resulta casi exclusiva de los partidos de alcance estrictamente local (secciones 5.4 y 6.1); tanto los partidos marginales como la élite institucionalizada y multinivel —polos opuestos en éxito electoral— carecen de ella en proporciones igual de altas. Un marco que se apoye en la ideología está, entonces, construido sobre datos faltantes justamente en los extremos de la distribución de poder que más le importan a la política pública.</w:t>
       </w:r>
     </w:p>
     <w:p>
@@ -276,7 +276,7 @@
           <w:sz w:val="22"/>
           <w:szCs w:val="22"/>
         </w:rPr>
-        <w:t xml:space="preserve">Esta relectura no es solo académica: el debate sobre la proliferación de partidos —“partidos de garaje” o “microempresas electorales”— ha sido central en las reformas al régimen de partidos (Acto Legislativo 01 de 2003, Ley 1475 de 2011, y las discusiones de 2023–2025). La preocupación de fondo es que muchas organizaciones obtienen o mantienen personería jurídica sin construir una organización duradera, lo que fragmenta la representación y encarece la administración electoral. Si la ideología no distingue bien a estos partidos, la institucionalización y la nacionalización sí podrían hacerlo, de forma más directamente accionable para el diseño de reglas.</w:t>
+        <w:t xml:space="preserve">Esta relectura no es solo académica: Pizarro Leongómez (2006) ya describía al sistema de partidos colombiano como un “gigante con pies de barro” —aparentemente sólido en votos, pero organizativamente frágil— y el debate sobre la proliferación de partidos —“partidos de garaje” o “microempresas electorales”— ha sido central en las reformas al régimen de partidos (Acto Legislativo 01 de 2003, Ley 1475 de 2011, y las discusiones de 2023–2025). La preocupación de fondo es que muchas organizaciones obtienen o mantienen personería jurídica sin construir una organización duradera, lo que fragmenta la representación y encarece la administración electoral. Si la ideología no distingue bien a estos partidos, la institucionalización y la nacionalización sí podrían hacerlo, de forma más directamente accionable para el diseño de reglas.</w:t>
       </w:r>
     </w:p>
     <w:p>
@@ -377,7 +377,7 @@
           <w:sz w:val="22"/>
           <w:szCs w:val="22"/>
         </w:rPr>
-        <w:t xml:space="preserve">El PCA se usó únicamente como herramienta de visualización e interpretación de cargas, no como reducción de dimensionalidad previa al clustering (K-Means corrió sobre las variables dummy estandarizadas). Los grupos se validaron con pruebas χ² de independencia frente a cada variable original, con la V de Cramér como tamaño de efecto y corrección de Benjamini-Hochberg para el múltiple testing (12 pruebas).</w:t>
+        <w:t xml:space="preserve">El PCA se usó únicamente como herramienta de visualización e interpretación de cargas, no como reducción de dimensionalidad previa al clustering (K-Means corrió sobre las variables dummy estandarizadas). Los grupos se validaron con pruebas χ² de independencia frente a cada variable original, con la V de Cramér como tamaño de efecto y corrección de Benjamini-Hochberg para el múltiple testing (12 pruebas). Un árbol de decisión y un Random Forest —descartados arriba para descubrir la tipología, precisamente porque exigirían una etiqueta previa— sí se usan más adelante (sección 5.3) en un papel distinto: una vez que el cluster ya existe, predecirlo a partir de las variables originales permite rankear su importancia de forma conjunta, no variable por variable como hace la V de Cramér.</w:t>
       </w:r>
     </w:p>
     <w:p>
@@ -390,7 +390,7 @@
           <w:sz w:val="22"/>
           <w:szCs w:val="22"/>
         </w:rPr>
-        <w:t xml:space="preserve">Conviene distinguir dos pasos que no deben confundirse: K-Means agrupa partidos únicamente a partir de patrones observados en los datos (participación electoral por nivel, tradicionalidad, grupo representativo); los nombres asignados a cada cluster (“institucionalizado”, “no institucionalizado”, “de nicho”) son una interpretación teórica posterior, apoyada en la literatura de la sección 2, no una medición directa del algoritmo. El modelo no mide institucionalización: descubre un patrón de longevidad y alcance multinivel que esa literatura permite nombrar así.</w:t>
+        <w:t xml:space="preserve">Conviene distinguir dos pasos que no deben confundirse: K-Means agrupa partidos únicamente a partir de patrones observados en los datos (participación electoral por nivel, tradicionalidad, grupo representativo); los nombres asignados a cada cluster (“institucionalizado”, “no institucionalizado”, “de nicho”) son una interpretación teórica posterior, apoyada en la literatura de la sección 2, no una medición directa del algoritmo. El modelo no mide institucionalización: descubre un patrón de alcance multinivel que esa literatura permite nombrar así. La longevidad —la aproximación más directa a institucionalización en Panebianco (1988) y Mainwaring y Scully (1995)— no participa en el clustering; se usa después, en la sección 5.5, como prueba independiente de si esa lectura es acertada.</w:t>
       </w:r>
     </w:p>
     <w:p>

</xml_diff>

<commit_message>
Ultima Versión Reporte PDF/MD
</commit_message>
<xml_diff>
--- a/reporte/Reporte_Final_Partidos_Politicos.docx
+++ b/reporte/Reporte_Final_Partidos_Politicos.docx
@@ -315,9 +315,9 @@
         <w:t>1. Pregunta de investigación</w:t>
       </w:r>
     </w:p>
+    <w:bookmarkEnd w:id="0"/>
     <w:p>
       <w:pPr>
-        <w:spacing w:after="160" w:line="276" w:lineRule="auto"/>
         <w:rPr>
           <w:rFonts w:ascii="Times New Roman" w:hAnsi="Times New Roman" w:cs="Times New Roman"/>
           <w:color w:val="000000" w:themeColor="text1"/>
@@ -332,10 +332,9 @@
           <w:sz w:val="24"/>
           <w:szCs w:val="24"/>
         </w:rPr>
-        <w:t>¿Qué grupos o patrones de partidos y movimientos políticos colombianos, pueden identificarse mediante técnicas de aprendizaje no supervisado entre 1848 y 2023?</w:t>
+        <w:t>¿Qué patrones de partidos y movimientos políticos colombianos pueden identificarse mediante aprendizaje no supervisado para el período 1848–2023?</w:t>
       </w:r>
     </w:p>
-    <w:bookmarkEnd w:id="0"/>
     <w:p>
       <w:pPr>
         <w:pStyle w:val="Heading1"/>
@@ -393,7 +392,7 @@
           <w:sz w:val="24"/>
           <w:szCs w:val="24"/>
         </w:rPr>
-        <w:t xml:space="preserve">2.1 Justificación Conceptual</w:t>
+        <w:t>2.1 Justificación Conceptual</w:t>
       </w:r>
     </w:p>
     <w:p>
@@ -553,9 +552,7 @@
           <w:sz w:val="24"/>
           <w:szCs w:val="24"/>
         </w:rPr>
-        <w:t xml:space="preserve">Este reporte busca identificar, sobre el universo completo de partidos y movimientos políticos registrados en Colombia, los patrones organizativos y electorales que emergen del análisis de </w:t>
-        <w:lastRenderedPageBreak/>
-        <w:t>aprendizaje no supervisado, evaluando en qué medida estos corresponden con las dimensiones de institucionalización y nacionalización propuestas en la literatura especializada.</w:t>
+        <w:t>Este reporte busca identificar, sobre el universo completo de partidos y movimientos políticos registrados en Colombia, los patrones organizativos y electorales que emergen del análisis de aprendizaje no supervisado, evaluando en qué medida estos corresponden con las dimensiones de institucionalización y nacionalización propuestas en la literatura especializada.</w:t>
       </w:r>
     </w:p>
     <w:p>
@@ -575,6 +572,7 @@
           <w:sz w:val="24"/>
           <w:szCs w:val="24"/>
         </w:rPr>
+        <w:lastRenderedPageBreak/>
         <w:t>3. Estrategia empírica</w:t>
       </w:r>
     </w:p>
@@ -764,9 +762,14 @@
         <w:rPr>
           <w:color w:val="000000"/>
         </w:rPr>
-        <w:t xml:space="preserve">El estudio utiliza dos fuentes de información complementarias del Centro de Estudios sobre Desarrollo Económico (CEDE) de la Universidad de los Andes. La primera corresponde a la base </w:t>
+        <w:t xml:space="preserve">El estudio utiliza dos fuentes de información complementarias del Centro de Estudios sobre Desarrollo Económico (CEDE) de la Universidad de los Andes. La primera corresponde a la base de datos de Cabra-Ruíz, Torres, Wills-Otero y Castilla-Gutiérrez (2023), que registra la totalidad de partidos, movimientos y coaliciones con participación electoral en Colombia entre 1958 y 2022. La unidad de observación es el partido, movimiento o coalición política, aunque la </w:t>
+      </w:r>
+      <w:r>
+        <w:rPr>
+          <w:color w:val="000000"/>
+        </w:rPr>
         <w:lastRenderedPageBreak/>
-        <w:t>de datos de Cabra-Ruíz, Torres, Wills-Otero y Castilla-Gutiérrez (2023), que registra la totalidad de partidos, movimientos y coaliciones con participación electoral en Colombia entre 1958 y 2022. La unidad de observación es el partido, movimiento o coalición política, aunque la variable</w:t>
+        <w:t>variable</w:t>
       </w:r>
       <w:r>
         <w:rPr>
@@ -815,16 +818,12 @@
         <w:pStyle w:val="Heading2"/>
         <w:rPr>
           <w:rFonts w:ascii="Times New Roman" w:hAnsi="Times New Roman" w:cs="Times New Roman"/>
-          <w:b/>
-          <w:bCs/>
           <w:color w:val="000000"/>
         </w:rPr>
       </w:pPr>
       <w:r>
         <w:rPr>
           <w:rFonts w:ascii="Times New Roman" w:hAnsi="Times New Roman" w:cs="Times New Roman"/>
-          <w:b/>
-          <w:bCs/>
           <w:color w:val="000000"/>
         </w:rPr>
         <w:t>4.1 Calidad y tratamiento de los datos</w:t>
@@ -1039,8 +1038,14 @@
         <w:rPr>
           <w:color w:val="000000"/>
         </w:rPr>
+        <w:t xml:space="preserve">En el caso de la base de resultados electorales, los votos fueron agregados por partido y nivel de elección. Dado el marcado sesgo positivo de su distribución, evidenciado por la amplia diferencia </w:t>
+      </w:r>
+      <w:r>
+        <w:rPr>
+          <w:color w:val="000000"/>
+        </w:rPr>
         <w:lastRenderedPageBreak/>
-        <w:t>En el caso de la base de resultados electorales, los votos fueron agregados por partido y nivel de elección. Dado el marcado sesgo positivo de su distribución, evidenciado por la amplia diferencia entre la media y la mediana, las variables fueron transformadas mediante la función</w:t>
+        <w:t>entre la media y la mediana, las variables fueron transformadas mediante la función</w:t>
       </w:r>
       <w:r>
         <w:rPr>
@@ -1321,8 +1326,17 @@
           <w:sz w:val="24"/>
           <w:szCs w:val="24"/>
         </w:rPr>
+        <w:t xml:space="preserve">El modelo final (k=4, nstart=100, iter.max=1000, semilla=20260706) explica el 25,2% de la varianza total (between_SS/total_SS) y alcanza un silhouette promedio de 0,26. La cohesión varía </w:t>
+      </w:r>
+      <w:r>
+        <w:rPr>
+          <w:rFonts w:ascii="Times New Roman" w:hAnsi="Times New Roman" w:cs="Times New Roman"/>
+          <w:color w:val="000000" w:themeColor="text1"/>
+          <w:sz w:val="24"/>
+          <w:szCs w:val="24"/>
+        </w:rPr>
         <w:lastRenderedPageBreak/>
-        <w:t>El modelo final (k=4, nstart=100, iter.max=1000, semilla=20260706) explica el 25,2% de la varianza total (between_SS/total_SS) y alcanza un silhouette promedio de 0,26. La cohesión varía entre grupos (Tabla A5, Anexos): los clusters 2 y 3 (los más grandes) muestran silhouette de 0,21 y 0,42 —buena separación—, mientras los clusters 4 y 1 muestran 0,12 y –0,04; el cluster 1, el más pequeño y sustantivamente más interesante, tiene menor cohesión y debe interpretarse con cautela (ver limitaciones).</w:t>
+        <w:t>entre grupos (Tabla A5, Anexos): los clusters 2 y 3 (los más grandes) muestran silhouette de 0,21 y 0,42 —buena separación—, mientras los clusters 4 y 1 muestran 0,12 y –0,04; el cluster 1, el más pequeño y sustantivamente más interesante, tiene menor cohesión y debe interpretarse con cautela (ver limitaciones).</w:t>
       </w:r>
     </w:p>
     <w:p>
@@ -1508,9 +1522,7 @@
           <w:sz w:val="24"/>
           <w:szCs w:val="24"/>
         </w:rPr>
-        <w:t xml:space="preserve">La V de Cramér evalúa cada variable de forma aislada frente al cluster, sin controlar por su correlación con las demás; dos variables redundantes entre sí pueden aparecer ambas como "fuertes" aunque aporten la misma señal, y el criterio no escala bien si el número de variables candidatas crece. Como complemento se entrenaron un árbol de decisión único y un Random Forest (500 árboles) para predecir el cluster a partir de las 12 variables originales en conjunto (75%/25% train/test, semilla=20260706). Ambos recuperan el cluster con exactitud muy alta (99,1% y 99,6%) —esperable, dado que K-Means ya agrupó a los partidos usando esas mismas </w:t>
-        <w:lastRenderedPageBreak/>
-        <w:t>variables—, con el cluster 1 —el más pequeño y menos cohesionado (sección 5.2)— como el más difícil de recuperar (recall 47,8% y 82,6%), coherente con su silhouette negativo.</w:t>
+        <w:t>La V de Cramér evalúa cada variable de forma aislada frente al cluster, sin controlar por su correlación con las demás; dos variables redundantes entre sí pueden aparecer ambas como "fuertes" aunque aporten la misma señal, y el criterio no escala bien si el número de variables candidatas crece. Como complemento se entrenaron un árbol de decisión único y un Random Forest (500 árboles) para predecir el cluster a partir de las 12 variables originales en conjunto (75%/25% train/test, semilla=20260706). Ambos recuperan el cluster con exactitud muy alta (99,1% y 99,6%) —esperable, dado que K-Means ya agrupó a los partidos usando esas mismas variables—, con el cluster 1 —el más pequeño y menos cohesionado (sección 5.2)— como el más difícil de recuperar (recall 47,8% y 82,6%), coherente con su silhouette negativo.</w:t>
       </w:r>
     </w:p>
     <w:p>
@@ -1530,6 +1542,7 @@
           <w:sz w:val="24"/>
           <w:szCs w:val="24"/>
         </w:rPr>
+        <w:lastRenderedPageBreak/>
         <w:t>El ranking de importancia multivariada (MeanDecreaseGini) coincide en general con la V de Cramér —correlación de rangos de Spearman de 0,79 con Random Forest y 0,62 con el árbol único (Tabla A7, Anexos)— pero difiere de forma reveladora en part_presidencia: la variable con mayor V de Cramér (0,821, aislada) cae al quinto lugar en Random Forest. La razón es que part_presidencia identifica casi por sí sola al cluster 1, pero ese mismo cluster ya queda bien delimitado por ideologia, grupo_representativo y gradonac; una vez esas variables están en el modelo, la información adicional que aporta part_presidencia es marginal. Es precisamente el tipo de redundancia que una prueba univariada, variable por variable, no puede detectar, y que un modelo multivariado sí revela de forma directa.</w:t>
       </w:r>
     </w:p>
@@ -1718,9 +1731,7 @@
           <w:sz w:val="24"/>
           <w:szCs w:val="24"/>
         </w:rPr>
-        <w:t xml:space="preserve">El patrón se sostiene en los siete niveles: “Partido institucionalizado” supera a “Partido no institucionalizado” por un factor de 60 a 1.300 veces, sin depender de una sola elección. “Partido de nicho” se distingue por presencia relativamente alta en gobernación/presidencia frente a </w:t>
-        <w:lastRenderedPageBreak/>
-        <w:t>votación mínima en senado, coherente con partidos de representación de intereses específicos que rara vez compiten a nivel nacional.</w:t>
+        <w:t>El patrón se sostiene en los siete niveles: “Partido institucionalizado” supera a “Partido no institucionalizado” por un factor de 60 a 1.300 veces, sin depender de una sola elección. “Partido de nicho” se distingue por presencia relativamente alta en gobernación/presidencia frente a votación mínima en senado, coherente con partidos de representación de intereses específicos que rara vez compiten a nivel nacional.</w:t>
       </w:r>
     </w:p>
     <w:p>
@@ -1742,6 +1753,7 @@
           <w:sz w:val="24"/>
           <w:szCs w:val="24"/>
         </w:rPr>
+        <w:lastRenderedPageBreak/>
         <w:drawing>
           <wp:inline distT="0" distB="0" distL="0" distR="0" wp14:anchorId="231A67AE" wp14:editId="47084ADD">
             <wp:extent cx="3714750" cy="2486025"/>
@@ -1944,9 +1956,7 @@
           <w:sz w:val="24"/>
           <w:szCs w:val="24"/>
         </w:rPr>
-        <w:t xml:space="preserve">Los datos son contundentes: el sistema de partidos colombiano no es un espectro continuo de ideologías, sino una pirámide radicalmente desigual de alcance electoral, y la ideología explica </w:t>
-        <w:lastRenderedPageBreak/>
-        <w:t>poco de esa desigualdad. El modelo identifica cuatro patrones, con implicaciones distintas para la regulación del sistema de partidos:</w:t>
+        <w:t>Los datos son contundentes: el sistema de partidos colombiano no es un espectro continuo de ideologías, sino una pirámide radicalmente desigual de alcance electoral, y la ideología explica poco de esa desigualdad. El modelo identifica cuatro patrones, con implicaciones distintas para la regulación del sistema de partidos:</w:t>
       </w:r>
     </w:p>
     <w:p>
@@ -1971,6 +1981,7 @@
           <w:sz w:val="24"/>
           <w:szCs w:val="24"/>
         </w:rPr>
+        <w:lastRenderedPageBreak/>
         <w:t>Cluster 1 — “Partidos institucionalizados y nacionalizados” (1.8%, n=93): el más pequeño y determinante. Participa en todos los niveles muy por encima del promedio (67.7% presidencia, 50.5% senado, 55.9% cámara), pero el 66.7% no tiene ideología clasificable — el éxito multinivel se asocia con menor perfil programático, consistente con un sistema más personalista/clientelar que doctrinario.</w:t>
       </w:r>
     </w:p>
@@ -2240,7 +2251,6 @@
           <w:sz w:val="24"/>
           <w:szCs w:val="24"/>
         </w:rPr>
-        <w:lastRenderedPageBreak/>
         <w:t>La escasa asociación entre institucionalización e identidad ideológica sugiere que el fortalecimiento de partidos programáticos requiere instrumentos específicos, más allá de asumir que el éxito electoral conduce, por sí mismo, a una mayor estructuración ideológica.</w:t>
       </w:r>
     </w:p>
@@ -2265,7 +2275,17 @@
           <w:sz w:val="24"/>
           <w:szCs w:val="24"/>
         </w:rPr>
-        <w:t>La tipología propuesta puede utilizarse como herramienta de seguimiento del sistema de partidos. Su aplicación periódica permitiría a la Registraduría Nacional y al Consejo Nacional Electoral evaluar si las reformas al régimen de partidos favorecen la consolidación de organizaciones estables o, por el contrario, incentivan la proliferación de partidos no institucionalizados.</w:t>
+        <w:t xml:space="preserve">La tipología propuesta puede utilizarse como herramienta de seguimiento del sistema de partidos. Su aplicación periódica permitiría a la Registraduría Nacional y al Consejo </w:t>
+      </w:r>
+      <w:r>
+        <w:rPr>
+          <w:rFonts w:ascii="Times New Roman" w:eastAsia="Times New Roman" w:hAnsi="Times New Roman" w:cs="Times New Roman"/>
+          <w:color w:val="000000"/>
+          <w:sz w:val="24"/>
+          <w:szCs w:val="24"/>
+        </w:rPr>
+        <w:lastRenderedPageBreak/>
+        <w:t>Nacional Electoral evaluar si las reformas al régimen de partidos favorecen la consolidación de organizaciones estables o, por el contrario, incentivan la proliferación de partidos no institucionalizados.</w:t>
       </w:r>
     </w:p>
     <w:p>
@@ -2497,7 +2517,6 @@
           <w:sz w:val="24"/>
           <w:szCs w:val="24"/>
         </w:rPr>
-        <w:lastRenderedPageBreak/>
         <w:t>7.2 Limitaciones</w:t>
       </w:r>
     </w:p>
@@ -2567,6 +2586,7 @@
           <w:sz w:val="24"/>
           <w:szCs w:val="24"/>
         </w:rPr>
+        <w:lastRenderedPageBreak/>
         <w:t>Estabilidad de los clusters:</w:t>
       </w:r>
       <w:r>
@@ -2909,7 +2929,6 @@
           <w:sz w:val="24"/>
           <w:szCs w:val="24"/>
         </w:rPr>
-        <w:lastRenderedPageBreak/>
         <w:t>Anexos</w:t>
       </w:r>
     </w:p>
@@ -2954,6 +2973,7 @@
           <w:sz w:val="24"/>
           <w:szCs w:val="24"/>
         </w:rPr>
+        <w:lastRenderedPageBreak/>
         <w:t>Tabla A1. Variables utilizadas en el modelo</w:t>
       </w:r>
     </w:p>
@@ -3502,12 +3522,6 @@
         <w:gridCol w:w="1388"/>
       </w:tblGrid>
       <w:tr>
-        <w:tblPrEx>
-          <w:tblCellMar>
-            <w:top w:w="0" w:type="dxa"/>
-            <w:bottom w:w="0" w:type="dxa"/>
-          </w:tblCellMar>
-        </w:tblPrEx>
         <w:trPr>
           <w:tblHeader/>
         </w:trPr>
@@ -3673,12 +3687,6 @@
         </w:tc>
       </w:tr>
       <w:tr>
-        <w:tblPrEx>
-          <w:tblCellMar>
-            <w:top w:w="0" w:type="dxa"/>
-            <w:bottom w:w="0" w:type="dxa"/>
-          </w:tblCellMar>
-        </w:tblPrEx>
         <w:tc>
           <w:tcPr>
             <w:tcW w:w="2400" w:type="dxa"/>
@@ -3832,12 +3840,6 @@
         </w:tc>
       </w:tr>
       <w:tr>
-        <w:tblPrEx>
-          <w:tblCellMar>
-            <w:top w:w="0" w:type="dxa"/>
-            <w:bottom w:w="0" w:type="dxa"/>
-          </w:tblCellMar>
-        </w:tblPrEx>
         <w:tc>
           <w:tcPr>
             <w:tcW w:w="2400" w:type="dxa"/>
@@ -3991,12 +3993,6 @@
         </w:tc>
       </w:tr>
       <w:tr>
-        <w:tblPrEx>
-          <w:tblCellMar>
-            <w:top w:w="0" w:type="dxa"/>
-            <w:bottom w:w="0" w:type="dxa"/>
-          </w:tblCellMar>
-        </w:tblPrEx>
         <w:tc>
           <w:tcPr>
             <w:tcW w:w="2400" w:type="dxa"/>
@@ -4150,12 +4146,6 @@
         </w:tc>
       </w:tr>
       <w:tr>
-        <w:tblPrEx>
-          <w:tblCellMar>
-            <w:top w:w="0" w:type="dxa"/>
-            <w:bottom w:w="0" w:type="dxa"/>
-          </w:tblCellMar>
-        </w:tblPrEx>
         <w:tc>
           <w:tcPr>
             <w:tcW w:w="2400" w:type="dxa"/>
@@ -4309,12 +4299,6 @@
         </w:tc>
       </w:tr>
       <w:tr>
-        <w:tblPrEx>
-          <w:tblCellMar>
-            <w:top w:w="0" w:type="dxa"/>
-            <w:bottom w:w="0" w:type="dxa"/>
-          </w:tblCellMar>
-        </w:tblPrEx>
         <w:tc>
           <w:tcPr>
             <w:tcW w:w="2400" w:type="dxa"/>
@@ -4468,12 +4452,6 @@
         </w:tc>
       </w:tr>
       <w:tr>
-        <w:tblPrEx>
-          <w:tblCellMar>
-            <w:top w:w="0" w:type="dxa"/>
-            <w:bottom w:w="0" w:type="dxa"/>
-          </w:tblCellMar>
-        </w:tblPrEx>
         <w:tc>
           <w:tcPr>
             <w:tcW w:w="2400" w:type="dxa"/>
@@ -4627,12 +4605,6 @@
         </w:tc>
       </w:tr>
       <w:tr>
-        <w:tblPrEx>
-          <w:tblCellMar>
-            <w:top w:w="0" w:type="dxa"/>
-            <w:bottom w:w="0" w:type="dxa"/>
-          </w:tblCellMar>
-        </w:tblPrEx>
         <w:tc>
           <w:tcPr>
             <w:tcW w:w="2400" w:type="dxa"/>
@@ -4786,12 +4758,6 @@
         </w:tc>
       </w:tr>
       <w:tr>
-        <w:tblPrEx>
-          <w:tblCellMar>
-            <w:top w:w="0" w:type="dxa"/>
-            <w:bottom w:w="0" w:type="dxa"/>
-          </w:tblCellMar>
-        </w:tblPrEx>
         <w:tc>
           <w:tcPr>
             <w:tcW w:w="2400" w:type="dxa"/>
@@ -4945,12 +4911,6 @@
         </w:tc>
       </w:tr>
       <w:tr>
-        <w:tblPrEx>
-          <w:tblCellMar>
-            <w:top w:w="0" w:type="dxa"/>
-            <w:bottom w:w="0" w:type="dxa"/>
-          </w:tblCellMar>
-        </w:tblPrEx>
         <w:tc>
           <w:tcPr>
             <w:tcW w:w="2400" w:type="dxa"/>
@@ -5104,12 +5064,6 @@
         </w:tc>
       </w:tr>
       <w:tr>
-        <w:tblPrEx>
-          <w:tblCellMar>
-            <w:top w:w="0" w:type="dxa"/>
-            <w:bottom w:w="0" w:type="dxa"/>
-          </w:tblCellMar>
-        </w:tblPrEx>
         <w:tc>
           <w:tcPr>
             <w:tcW w:w="2400" w:type="dxa"/>
@@ -5263,12 +5217,6 @@
         </w:tc>
       </w:tr>
       <w:tr>
-        <w:tblPrEx>
-          <w:tblCellMar>
-            <w:top w:w="0" w:type="dxa"/>
-            <w:bottom w:w="0" w:type="dxa"/>
-          </w:tblCellMar>
-        </w:tblPrEx>
         <w:tc>
           <w:tcPr>
             <w:tcW w:w="2400" w:type="dxa"/>
@@ -5422,12 +5370,6 @@
         </w:tc>
       </w:tr>
       <w:tr>
-        <w:tblPrEx>
-          <w:tblCellMar>
-            <w:top w:w="0" w:type="dxa"/>
-            <w:bottom w:w="0" w:type="dxa"/>
-          </w:tblCellMar>
-        </w:tblPrEx>
         <w:tc>
           <w:tcPr>
             <w:tcW w:w="2400" w:type="dxa"/>
@@ -5581,12 +5523,6 @@
         </w:tc>
       </w:tr>
       <w:tr>
-        <w:tblPrEx>
-          <w:tblCellMar>
-            <w:top w:w="0" w:type="dxa"/>
-            <w:bottom w:w="0" w:type="dxa"/>
-          </w:tblCellMar>
-        </w:tblPrEx>
         <w:tc>
           <w:tcPr>
             <w:tcW w:w="2400" w:type="dxa"/>
@@ -5740,12 +5676,6 @@
         </w:tc>
       </w:tr>
       <w:tr>
-        <w:tblPrEx>
-          <w:tblCellMar>
-            <w:top w:w="0" w:type="dxa"/>
-            <w:bottom w:w="0" w:type="dxa"/>
-          </w:tblCellMar>
-        </w:tblPrEx>
         <w:tc>
           <w:tcPr>
             <w:tcW w:w="2400" w:type="dxa"/>
@@ -5899,12 +5829,6 @@
         </w:tc>
       </w:tr>
       <w:tr>
-        <w:tblPrEx>
-          <w:tblCellMar>
-            <w:top w:w="0" w:type="dxa"/>
-            <w:bottom w:w="0" w:type="dxa"/>
-          </w:tblCellMar>
-        </w:tblPrEx>
         <w:tc>
           <w:tcPr>
             <w:tcW w:w="2400" w:type="dxa"/>
@@ -6101,7 +6025,6 @@
           <w:sz w:val="24"/>
           <w:szCs w:val="24"/>
         </w:rPr>
-        <w:lastRenderedPageBreak/>
         <w:t>Tabla A3. Participación electoral por nivel (n=5.143)</w:t>
       </w:r>
     </w:p>
@@ -6128,12 +6051,6 @@
         <w:gridCol w:w="3120"/>
       </w:tblGrid>
       <w:tr>
-        <w:tblPrEx>
-          <w:tblCellMar>
-            <w:top w:w="0" w:type="dxa"/>
-            <w:bottom w:w="0" w:type="dxa"/>
-          </w:tblCellMar>
-        </w:tblPrEx>
         <w:trPr>
           <w:tblHeader/>
         </w:trPr>
@@ -6259,12 +6176,6 @@
         </w:tc>
       </w:tr>
       <w:tr>
-        <w:tblPrEx>
-          <w:tblCellMar>
-            <w:top w:w="0" w:type="dxa"/>
-            <w:bottom w:w="0" w:type="dxa"/>
-          </w:tblCellMar>
-        </w:tblPrEx>
         <w:tc>
           <w:tcPr>
             <w:tcW w:w="3120" w:type="dxa"/>
@@ -6380,12 +6291,6 @@
         </w:tc>
       </w:tr>
       <w:tr>
-        <w:tblPrEx>
-          <w:tblCellMar>
-            <w:top w:w="0" w:type="dxa"/>
-            <w:bottom w:w="0" w:type="dxa"/>
-          </w:tblCellMar>
-        </w:tblPrEx>
         <w:tc>
           <w:tcPr>
             <w:tcW w:w="3120" w:type="dxa"/>
@@ -6419,6 +6324,7 @@
                 <w:sz w:val="24"/>
                 <w:szCs w:val="24"/>
               </w:rPr>
+              <w:lastRenderedPageBreak/>
               <w:t>Concejo</w:t>
             </w:r>
           </w:p>
@@ -6501,12 +6407,6 @@
         </w:tc>
       </w:tr>
       <w:tr>
-        <w:tblPrEx>
-          <w:tblCellMar>
-            <w:top w:w="0" w:type="dxa"/>
-            <w:bottom w:w="0" w:type="dxa"/>
-          </w:tblCellMar>
-        </w:tblPrEx>
         <w:tc>
           <w:tcPr>
             <w:tcW w:w="3120" w:type="dxa"/>
@@ -6622,12 +6522,6 @@
         </w:tc>
       </w:tr>
       <w:tr>
-        <w:tblPrEx>
-          <w:tblCellMar>
-            <w:top w:w="0" w:type="dxa"/>
-            <w:bottom w:w="0" w:type="dxa"/>
-          </w:tblCellMar>
-        </w:tblPrEx>
         <w:tc>
           <w:tcPr>
             <w:tcW w:w="3120" w:type="dxa"/>
@@ -6743,12 +6637,6 @@
         </w:tc>
       </w:tr>
       <w:tr>
-        <w:tblPrEx>
-          <w:tblCellMar>
-            <w:top w:w="0" w:type="dxa"/>
-            <w:bottom w:w="0" w:type="dxa"/>
-          </w:tblCellMar>
-        </w:tblPrEx>
         <w:tc>
           <w:tcPr>
             <w:tcW w:w="3120" w:type="dxa"/>
@@ -6864,12 +6752,6 @@
         </w:tc>
       </w:tr>
       <w:tr>
-        <w:tblPrEx>
-          <w:tblCellMar>
-            <w:top w:w="0" w:type="dxa"/>
-            <w:bottom w:w="0" w:type="dxa"/>
-          </w:tblCellMar>
-        </w:tblPrEx>
         <w:tc>
           <w:tcPr>
             <w:tcW w:w="3120" w:type="dxa"/>
@@ -6985,12 +6867,6 @@
         </w:tc>
       </w:tr>
       <w:tr>
-        <w:tblPrEx>
-          <w:tblCellMar>
-            <w:top w:w="0" w:type="dxa"/>
-            <w:bottom w:w="0" w:type="dxa"/>
-          </w:tblCellMar>
-        </w:tblPrEx>
         <w:tc>
           <w:tcPr>
             <w:tcW w:w="3120" w:type="dxa"/>
@@ -7176,12 +7052,6 @@
         <w:gridCol w:w="2280"/>
       </w:tblGrid>
       <w:tr>
-        <w:tblPrEx>
-          <w:tblCellMar>
-            <w:top w:w="0" w:type="dxa"/>
-            <w:bottom w:w="0" w:type="dxa"/>
-          </w:tblCellMar>
-        </w:tblPrEx>
         <w:trPr>
           <w:tblHeader/>
         </w:trPr>
@@ -7347,12 +7217,6 @@
         </w:tc>
       </w:tr>
       <w:tr>
-        <w:tblPrEx>
-          <w:tblCellMar>
-            <w:top w:w="0" w:type="dxa"/>
-            <w:bottom w:w="0" w:type="dxa"/>
-          </w:tblCellMar>
-        </w:tblPrEx>
         <w:tc>
           <w:tcPr>
             <w:tcW w:w="1200" w:type="dxa"/>
@@ -7506,12 +7370,6 @@
         </w:tc>
       </w:tr>
       <w:tr>
-        <w:tblPrEx>
-          <w:tblCellMar>
-            <w:top w:w="0" w:type="dxa"/>
-            <w:bottom w:w="0" w:type="dxa"/>
-          </w:tblCellMar>
-        </w:tblPrEx>
         <w:tc>
           <w:tcPr>
             <w:tcW w:w="1200" w:type="dxa"/>
@@ -7665,12 +7523,6 @@
         </w:tc>
       </w:tr>
       <w:tr>
-        <w:tblPrEx>
-          <w:tblCellMar>
-            <w:top w:w="0" w:type="dxa"/>
-            <w:bottom w:w="0" w:type="dxa"/>
-          </w:tblCellMar>
-        </w:tblPrEx>
         <w:tc>
           <w:tcPr>
             <w:tcW w:w="1200" w:type="dxa"/>
@@ -7824,12 +7676,6 @@
         </w:tc>
       </w:tr>
       <w:tr>
-        <w:tblPrEx>
-          <w:tblCellMar>
-            <w:top w:w="0" w:type="dxa"/>
-            <w:bottom w:w="0" w:type="dxa"/>
-          </w:tblCellMar>
-        </w:tblPrEx>
         <w:tc>
           <w:tcPr>
             <w:tcW w:w="1200" w:type="dxa"/>
@@ -7983,12 +7829,6 @@
         </w:tc>
       </w:tr>
       <w:tr>
-        <w:tblPrEx>
-          <w:tblCellMar>
-            <w:top w:w="0" w:type="dxa"/>
-            <w:bottom w:w="0" w:type="dxa"/>
-          </w:tblCellMar>
-        </w:tblPrEx>
         <w:tc>
           <w:tcPr>
             <w:tcW w:w="1200" w:type="dxa"/>
@@ -8142,12 +7982,6 @@
         </w:tc>
       </w:tr>
       <w:tr>
-        <w:tblPrEx>
-          <w:tblCellMar>
-            <w:top w:w="0" w:type="dxa"/>
-            <w:bottom w:w="0" w:type="dxa"/>
-          </w:tblCellMar>
-        </w:tblPrEx>
         <w:tc>
           <w:tcPr>
             <w:tcW w:w="1200" w:type="dxa"/>
@@ -8301,12 +8135,6 @@
         </w:tc>
       </w:tr>
       <w:tr>
-        <w:tblPrEx>
-          <w:tblCellMar>
-            <w:top w:w="0" w:type="dxa"/>
-            <w:bottom w:w="0" w:type="dxa"/>
-          </w:tblCellMar>
-        </w:tblPrEx>
         <w:tc>
           <w:tcPr>
             <w:tcW w:w="1200" w:type="dxa"/>
@@ -8460,12 +8288,6 @@
         </w:tc>
       </w:tr>
       <w:tr>
-        <w:tblPrEx>
-          <w:tblCellMar>
-            <w:top w:w="0" w:type="dxa"/>
-            <w:bottom w:w="0" w:type="dxa"/>
-          </w:tblCellMar>
-        </w:tblPrEx>
         <w:tc>
           <w:tcPr>
             <w:tcW w:w="1200" w:type="dxa"/>
@@ -8619,12 +8441,6 @@
         </w:tc>
       </w:tr>
       <w:tr>
-        <w:tblPrEx>
-          <w:tblCellMar>
-            <w:top w:w="0" w:type="dxa"/>
-            <w:bottom w:w="0" w:type="dxa"/>
-          </w:tblCellMar>
-        </w:tblPrEx>
         <w:tc>
           <w:tcPr>
             <w:tcW w:w="1200" w:type="dxa"/>
@@ -8848,12 +8664,6 @@
         <w:gridCol w:w="2600"/>
       </w:tblGrid>
       <w:tr>
-        <w:tblPrEx>
-          <w:tblCellMar>
-            <w:top w:w="0" w:type="dxa"/>
-            <w:bottom w:w="0" w:type="dxa"/>
-          </w:tblCellMar>
-        </w:tblPrEx>
         <w:trPr>
           <w:tblHeader/>
         </w:trPr>
@@ -9019,12 +8829,6 @@
         </w:tc>
       </w:tr>
       <w:tr>
-        <w:tblPrEx>
-          <w:tblCellMar>
-            <w:top w:w="0" w:type="dxa"/>
-            <w:bottom w:w="0" w:type="dxa"/>
-          </w:tblCellMar>
-        </w:tblPrEx>
         <w:tc>
           <w:tcPr>
             <w:tcW w:w="1560" w:type="dxa"/>
@@ -9178,12 +8982,6 @@
         </w:tc>
       </w:tr>
       <w:tr>
-        <w:tblPrEx>
-          <w:tblCellMar>
-            <w:top w:w="0" w:type="dxa"/>
-            <w:bottom w:w="0" w:type="dxa"/>
-          </w:tblCellMar>
-        </w:tblPrEx>
         <w:tc>
           <w:tcPr>
             <w:tcW w:w="1560" w:type="dxa"/>
@@ -9337,12 +9135,6 @@
         </w:tc>
       </w:tr>
       <w:tr>
-        <w:tblPrEx>
-          <w:tblCellMar>
-            <w:top w:w="0" w:type="dxa"/>
-            <w:bottom w:w="0" w:type="dxa"/>
-          </w:tblCellMar>
-        </w:tblPrEx>
         <w:tc>
           <w:tcPr>
             <w:tcW w:w="1560" w:type="dxa"/>
@@ -9496,12 +9288,6 @@
         </w:tc>
       </w:tr>
       <w:tr>
-        <w:tblPrEx>
-          <w:tblCellMar>
-            <w:top w:w="0" w:type="dxa"/>
-            <w:bottom w:w="0" w:type="dxa"/>
-          </w:tblCellMar>
-        </w:tblPrEx>
         <w:tc>
           <w:tcPr>
             <w:tcW w:w="1560" w:type="dxa"/>
@@ -9725,12 +9511,6 @@
         <w:gridCol w:w="2360"/>
       </w:tblGrid>
       <w:tr>
-        <w:tblPrEx>
-          <w:tblCellMar>
-            <w:top w:w="0" w:type="dxa"/>
-            <w:bottom w:w="0" w:type="dxa"/>
-          </w:tblCellMar>
-        </w:tblPrEx>
         <w:trPr>
           <w:tblHeader/>
         </w:trPr>
@@ -9896,12 +9676,6 @@
         </w:tc>
       </w:tr>
       <w:tr>
-        <w:tblPrEx>
-          <w:tblCellMar>
-            <w:top w:w="0" w:type="dxa"/>
-            <w:bottom w:w="0" w:type="dxa"/>
-          </w:tblCellMar>
-        </w:tblPrEx>
         <w:tc>
           <w:tcPr>
             <w:tcW w:w="3160" w:type="dxa"/>
@@ -10055,12 +9829,6 @@
         </w:tc>
       </w:tr>
       <w:tr>
-        <w:tblPrEx>
-          <w:tblCellMar>
-            <w:top w:w="0" w:type="dxa"/>
-            <w:bottom w:w="0" w:type="dxa"/>
-          </w:tblCellMar>
-        </w:tblPrEx>
         <w:tc>
           <w:tcPr>
             <w:tcW w:w="3160" w:type="dxa"/>
@@ -10094,7 +9862,6 @@
                 <w:sz w:val="24"/>
                 <w:szCs w:val="24"/>
               </w:rPr>
-              <w:lastRenderedPageBreak/>
               <w:t>ideologia</w:t>
             </w:r>
           </w:p>
@@ -10215,12 +9982,6 @@
         </w:tc>
       </w:tr>
       <w:tr>
-        <w:tblPrEx>
-          <w:tblCellMar>
-            <w:top w:w="0" w:type="dxa"/>
-            <w:bottom w:w="0" w:type="dxa"/>
-          </w:tblCellMar>
-        </w:tblPrEx>
         <w:tc>
           <w:tcPr>
             <w:tcW w:w="3160" w:type="dxa"/>
@@ -10374,12 +10135,6 @@
         </w:tc>
       </w:tr>
       <w:tr>
-        <w:tblPrEx>
-          <w:tblCellMar>
-            <w:top w:w="0" w:type="dxa"/>
-            <w:bottom w:w="0" w:type="dxa"/>
-          </w:tblCellMar>
-        </w:tblPrEx>
         <w:tc>
           <w:tcPr>
             <w:tcW w:w="3160" w:type="dxa"/>
@@ -10413,6 +10168,7 @@
                 <w:sz w:val="24"/>
                 <w:szCs w:val="24"/>
               </w:rPr>
+              <w:lastRenderedPageBreak/>
               <w:t>grupo_representativo_1</w:t>
             </w:r>
           </w:p>
@@ -10533,12 +10289,6 @@
         </w:tc>
       </w:tr>
       <w:tr>
-        <w:tblPrEx>
-          <w:tblCellMar>
-            <w:top w:w="0" w:type="dxa"/>
-            <w:bottom w:w="0" w:type="dxa"/>
-          </w:tblCellMar>
-        </w:tblPrEx>
         <w:tc>
           <w:tcPr>
             <w:tcW w:w="3160" w:type="dxa"/>
@@ -10692,12 +10442,6 @@
         </w:tc>
       </w:tr>
       <w:tr>
-        <w:tblPrEx>
-          <w:tblCellMar>
-            <w:top w:w="0" w:type="dxa"/>
-            <w:bottom w:w="0" w:type="dxa"/>
-          </w:tblCellMar>
-        </w:tblPrEx>
         <w:tc>
           <w:tcPr>
             <w:tcW w:w="3160" w:type="dxa"/>
@@ -10851,12 +10595,6 @@
         </w:tc>
       </w:tr>
       <w:tr>
-        <w:tblPrEx>
-          <w:tblCellMar>
-            <w:top w:w="0" w:type="dxa"/>
-            <w:bottom w:w="0" w:type="dxa"/>
-          </w:tblCellMar>
-        </w:tblPrEx>
         <w:tc>
           <w:tcPr>
             <w:tcW w:w="3160" w:type="dxa"/>
@@ -11080,12 +10818,6 @@
         <w:gridCol w:w="2200"/>
       </w:tblGrid>
       <w:tr>
-        <w:tblPrEx>
-          <w:tblCellMar>
-            <w:top w:w="0" w:type="dxa"/>
-            <w:bottom w:w="0" w:type="dxa"/>
-          </w:tblCellMar>
-        </w:tblPrEx>
         <w:trPr>
           <w:tblHeader/>
         </w:trPr>
@@ -11251,12 +10983,6 @@
         </w:tc>
       </w:tr>
       <w:tr>
-        <w:tblPrEx>
-          <w:tblCellMar>
-            <w:top w:w="0" w:type="dxa"/>
-            <w:bottom w:w="0" w:type="dxa"/>
-          </w:tblCellMar>
-        </w:tblPrEx>
         <w:tc>
           <w:tcPr>
             <w:tcW w:w="2600" w:type="dxa"/>
@@ -11410,12 +11136,6 @@
         </w:tc>
       </w:tr>
       <w:tr>
-        <w:tblPrEx>
-          <w:tblCellMar>
-            <w:top w:w="0" w:type="dxa"/>
-            <w:bottom w:w="0" w:type="dxa"/>
-          </w:tblCellMar>
-        </w:tblPrEx>
         <w:tc>
           <w:tcPr>
             <w:tcW w:w="2600" w:type="dxa"/>
@@ -11569,12 +11289,6 @@
         </w:tc>
       </w:tr>
       <w:tr>
-        <w:tblPrEx>
-          <w:tblCellMar>
-            <w:top w:w="0" w:type="dxa"/>
-            <w:bottom w:w="0" w:type="dxa"/>
-          </w:tblCellMar>
-        </w:tblPrEx>
         <w:tc>
           <w:tcPr>
             <w:tcW w:w="2600" w:type="dxa"/>
@@ -11728,12 +11442,6 @@
         </w:tc>
       </w:tr>
       <w:tr>
-        <w:tblPrEx>
-          <w:tblCellMar>
-            <w:top w:w="0" w:type="dxa"/>
-            <w:bottom w:w="0" w:type="dxa"/>
-          </w:tblCellMar>
-        </w:tblPrEx>
         <w:tc>
           <w:tcPr>
             <w:tcW w:w="2600" w:type="dxa"/>
@@ -11887,12 +11595,6 @@
         </w:tc>
       </w:tr>
       <w:tr>
-        <w:tblPrEx>
-          <w:tblCellMar>
-            <w:top w:w="0" w:type="dxa"/>
-            <w:bottom w:w="0" w:type="dxa"/>
-          </w:tblCellMar>
-        </w:tblPrEx>
         <w:tc>
           <w:tcPr>
             <w:tcW w:w="2600" w:type="dxa"/>
@@ -12046,12 +11748,6 @@
         </w:tc>
       </w:tr>
       <w:tr>
-        <w:tblPrEx>
-          <w:tblCellMar>
-            <w:top w:w="0" w:type="dxa"/>
-            <w:bottom w:w="0" w:type="dxa"/>
-          </w:tblCellMar>
-        </w:tblPrEx>
         <w:tc>
           <w:tcPr>
             <w:tcW w:w="2600" w:type="dxa"/>
@@ -12205,12 +11901,6 @@
         </w:tc>
       </w:tr>
       <w:tr>
-        <w:tblPrEx>
-          <w:tblCellMar>
-            <w:top w:w="0" w:type="dxa"/>
-            <w:bottom w:w="0" w:type="dxa"/>
-          </w:tblCellMar>
-        </w:tblPrEx>
         <w:tc>
           <w:tcPr>
             <w:tcW w:w="2600" w:type="dxa"/>
@@ -12364,12 +12054,6 @@
         </w:tc>
       </w:tr>
       <w:tr>
-        <w:tblPrEx>
-          <w:tblCellMar>
-            <w:top w:w="0" w:type="dxa"/>
-            <w:bottom w:w="0" w:type="dxa"/>
-          </w:tblCellMar>
-        </w:tblPrEx>
         <w:tc>
           <w:tcPr>
             <w:tcW w:w="2600" w:type="dxa"/>
@@ -12523,12 +12207,6 @@
         </w:tc>
       </w:tr>
       <w:tr>
-        <w:tblPrEx>
-          <w:tblCellMar>
-            <w:top w:w="0" w:type="dxa"/>
-            <w:bottom w:w="0" w:type="dxa"/>
-          </w:tblCellMar>
-        </w:tblPrEx>
         <w:tc>
           <w:tcPr>
             <w:tcW w:w="2600" w:type="dxa"/>
@@ -12682,12 +12360,6 @@
         </w:tc>
       </w:tr>
       <w:tr>
-        <w:tblPrEx>
-          <w:tblCellMar>
-            <w:top w:w="0" w:type="dxa"/>
-            <w:bottom w:w="0" w:type="dxa"/>
-          </w:tblCellMar>
-        </w:tblPrEx>
         <w:tc>
           <w:tcPr>
             <w:tcW w:w="2600" w:type="dxa"/>
@@ -12841,12 +12513,6 @@
         </w:tc>
       </w:tr>
       <w:tr>
-        <w:tblPrEx>
-          <w:tblCellMar>
-            <w:top w:w="0" w:type="dxa"/>
-            <w:bottom w:w="0" w:type="dxa"/>
-          </w:tblCellMar>
-        </w:tblPrEx>
         <w:tc>
           <w:tcPr>
             <w:tcW w:w="2600" w:type="dxa"/>
@@ -13000,12 +12666,6 @@
         </w:tc>
       </w:tr>
       <w:tr>
-        <w:tblPrEx>
-          <w:tblCellMar>
-            <w:top w:w="0" w:type="dxa"/>
-            <w:bottom w:w="0" w:type="dxa"/>
-          </w:tblCellMar>
-        </w:tblPrEx>
         <w:tc>
           <w:tcPr>
             <w:tcW w:w="2600" w:type="dxa"/>
@@ -13231,12 +12891,6 @@
         <w:gridCol w:w="1860"/>
       </w:tblGrid>
       <w:tr>
-        <w:tblPrEx>
-          <w:tblCellMar>
-            <w:top w:w="0" w:type="dxa"/>
-            <w:bottom w:w="0" w:type="dxa"/>
-          </w:tblCellMar>
-        </w:tblPrEx>
         <w:trPr>
           <w:tblHeader/>
         </w:trPr>
@@ -13482,12 +13136,6 @@
         </w:tc>
       </w:tr>
       <w:tr>
-        <w:tblPrEx>
-          <w:tblCellMar>
-            <w:top w:w="0" w:type="dxa"/>
-            <w:bottom w:w="0" w:type="dxa"/>
-          </w:tblCellMar>
-        </w:tblPrEx>
         <w:tc>
           <w:tcPr>
             <w:tcW w:w="1900" w:type="dxa"/>
@@ -13717,12 +13365,6 @@
         </w:tc>
       </w:tr>
       <w:tr>
-        <w:tblPrEx>
-          <w:tblCellMar>
-            <w:top w:w="0" w:type="dxa"/>
-            <w:bottom w:w="0" w:type="dxa"/>
-          </w:tblCellMar>
-        </w:tblPrEx>
         <w:tc>
           <w:tcPr>
             <w:tcW w:w="1900" w:type="dxa"/>
@@ -13952,12 +13594,6 @@
         </w:tc>
       </w:tr>
       <w:tr>
-        <w:tblPrEx>
-          <w:tblCellMar>
-            <w:top w:w="0" w:type="dxa"/>
-            <w:bottom w:w="0" w:type="dxa"/>
-          </w:tblCellMar>
-        </w:tblPrEx>
         <w:tc>
           <w:tcPr>
             <w:tcW w:w="1900" w:type="dxa"/>
@@ -14187,12 +13823,6 @@
         </w:tc>
       </w:tr>
       <w:tr>
-        <w:tblPrEx>
-          <w:tblCellMar>
-            <w:top w:w="0" w:type="dxa"/>
-            <w:bottom w:w="0" w:type="dxa"/>
-          </w:tblCellMar>
-        </w:tblPrEx>
         <w:tc>
           <w:tcPr>
             <w:tcW w:w="1900" w:type="dxa"/>
@@ -14422,12 +14052,6 @@
         </w:tc>
       </w:tr>
       <w:tr>
-        <w:tblPrEx>
-          <w:tblCellMar>
-            <w:top w:w="0" w:type="dxa"/>
-            <w:bottom w:w="0" w:type="dxa"/>
-          </w:tblCellMar>
-        </w:tblPrEx>
         <w:tc>
           <w:tcPr>
             <w:tcW w:w="1900" w:type="dxa"/>
@@ -14657,12 +14281,6 @@
         </w:tc>
       </w:tr>
       <w:tr>
-        <w:tblPrEx>
-          <w:tblCellMar>
-            <w:top w:w="0" w:type="dxa"/>
-            <w:bottom w:w="0" w:type="dxa"/>
-          </w:tblCellMar>
-        </w:tblPrEx>
         <w:tc>
           <w:tcPr>
             <w:tcW w:w="1900" w:type="dxa"/>
@@ -14696,7 +14314,6 @@
                 <w:sz w:val="24"/>
                 <w:szCs w:val="24"/>
               </w:rPr>
-              <w:lastRenderedPageBreak/>
               <w:t>Presidencia</w:t>
             </w:r>
           </w:p>
@@ -14893,12 +14510,6 @@
         </w:tc>
       </w:tr>
       <w:tr>
-        <w:tblPrEx>
-          <w:tblCellMar>
-            <w:top w:w="0" w:type="dxa"/>
-            <w:bottom w:w="0" w:type="dxa"/>
-          </w:tblCellMar>
-        </w:tblPrEx>
         <w:tc>
           <w:tcPr>
             <w:tcW w:w="1900" w:type="dxa"/>
@@ -15147,6 +14758,7 @@
           <w:sz w:val="24"/>
           <w:szCs w:val="24"/>
         </w:rPr>
+        <w:lastRenderedPageBreak/>
         <w:t>Fuente: elaboración propia con datos de Torres, Barinas-Forero, Forero-Mesa, Sánchez &amp; Tibavisco (2023).</w:t>
       </w:r>
     </w:p>
@@ -15199,12 +14811,6 @@
         <w:gridCol w:w="3200"/>
       </w:tblGrid>
       <w:tr>
-        <w:tblPrEx>
-          <w:tblCellMar>
-            <w:top w:w="0" w:type="dxa"/>
-            <w:bottom w:w="0" w:type="dxa"/>
-          </w:tblCellMar>
-        </w:tblPrEx>
         <w:trPr>
           <w:tblHeader/>
         </w:trPr>
@@ -15410,12 +15016,6 @@
         </w:tc>
       </w:tr>
       <w:tr>
-        <w:tblPrEx>
-          <w:tblCellMar>
-            <w:top w:w="0" w:type="dxa"/>
-            <w:bottom w:w="0" w:type="dxa"/>
-          </w:tblCellMar>
-        </w:tblPrEx>
         <w:tc>
           <w:tcPr>
             <w:tcW w:w="2200" w:type="dxa"/>
@@ -15607,12 +15207,6 @@
         </w:tc>
       </w:tr>
       <w:tr>
-        <w:tblPrEx>
-          <w:tblCellMar>
-            <w:top w:w="0" w:type="dxa"/>
-            <w:bottom w:w="0" w:type="dxa"/>
-          </w:tblCellMar>
-        </w:tblPrEx>
         <w:tc>
           <w:tcPr>
             <w:tcW w:w="2200" w:type="dxa"/>
@@ -15804,12 +15398,6 @@
         </w:tc>
       </w:tr>
       <w:tr>
-        <w:tblPrEx>
-          <w:tblCellMar>
-            <w:top w:w="0" w:type="dxa"/>
-            <w:bottom w:w="0" w:type="dxa"/>
-          </w:tblCellMar>
-        </w:tblPrEx>
         <w:tc>
           <w:tcPr>
             <w:tcW w:w="2200" w:type="dxa"/>
@@ -16075,12 +15663,6 @@
         <w:gridCol w:w="904"/>
       </w:tblGrid>
       <w:tr>
-        <w:tblPrEx>
-          <w:tblCellMar>
-            <w:top w:w="0" w:type="dxa"/>
-            <w:bottom w:w="0" w:type="dxa"/>
-          </w:tblCellMar>
-        </w:tblPrEx>
         <w:trPr>
           <w:tblHeader/>
         </w:trPr>
@@ -16406,12 +15988,6 @@
         </w:tc>
       </w:tr>
       <w:tr>
-        <w:tblPrEx>
-          <w:tblCellMar>
-            <w:top w:w="0" w:type="dxa"/>
-            <w:bottom w:w="0" w:type="dxa"/>
-          </w:tblCellMar>
-        </w:tblPrEx>
         <w:tc>
           <w:tcPr>
             <w:tcW w:w="2200" w:type="dxa"/>
@@ -16717,12 +16293,6 @@
         </w:tc>
       </w:tr>
       <w:tr>
-        <w:tblPrEx>
-          <w:tblCellMar>
-            <w:top w:w="0" w:type="dxa"/>
-            <w:bottom w:w="0" w:type="dxa"/>
-          </w:tblCellMar>
-        </w:tblPrEx>
         <w:tc>
           <w:tcPr>
             <w:tcW w:w="2200" w:type="dxa"/>
@@ -17028,12 +16598,6 @@
         </w:tc>
       </w:tr>
       <w:tr>
-        <w:tblPrEx>
-          <w:tblCellMar>
-            <w:top w:w="0" w:type="dxa"/>
-            <w:bottom w:w="0" w:type="dxa"/>
-          </w:tblCellMar>
-        </w:tblPrEx>
         <w:tc>
           <w:tcPr>
             <w:tcW w:w="2200" w:type="dxa"/>
@@ -17410,12 +16974,6 @@
         <w:gridCol w:w="1780"/>
       </w:tblGrid>
       <w:tr>
-        <w:tblPrEx>
-          <w:tblCellMar>
-            <w:top w:w="0" w:type="dxa"/>
-            <w:bottom w:w="0" w:type="dxa"/>
-          </w:tblCellMar>
-        </w:tblPrEx>
         <w:trPr>
           <w:tblHeader/>
         </w:trPr>
@@ -17621,12 +17179,6 @@
         </w:tc>
       </w:tr>
       <w:tr>
-        <w:tblPrEx>
-          <w:tblCellMar>
-            <w:top w:w="0" w:type="dxa"/>
-            <w:bottom w:w="0" w:type="dxa"/>
-          </w:tblCellMar>
-        </w:tblPrEx>
         <w:tc>
           <w:tcPr>
             <w:tcW w:w="2600" w:type="dxa"/>
@@ -17818,12 +17370,6 @@
         </w:tc>
       </w:tr>
       <w:tr>
-        <w:tblPrEx>
-          <w:tblCellMar>
-            <w:top w:w="0" w:type="dxa"/>
-            <w:bottom w:w="0" w:type="dxa"/>
-          </w:tblCellMar>
-        </w:tblPrEx>
         <w:tc>
           <w:tcPr>
             <w:tcW w:w="2600" w:type="dxa"/>
@@ -18015,12 +17561,6 @@
         </w:tc>
       </w:tr>
       <w:tr>
-        <w:tblPrEx>
-          <w:tblCellMar>
-            <w:top w:w="0" w:type="dxa"/>
-            <w:bottom w:w="0" w:type="dxa"/>
-          </w:tblCellMar>
-        </w:tblPrEx>
         <w:tc>
           <w:tcPr>
             <w:tcW w:w="2600" w:type="dxa"/>
@@ -18255,7 +17795,6 @@
           <w:sz w:val="24"/>
           <w:szCs w:val="24"/>
         </w:rPr>
-        <w:lastRenderedPageBreak/>
         <w:t>Tabla A12. Composición de clusters (segundo nivel) por periodo de fundación</w:t>
       </w:r>
     </w:p>
@@ -18284,12 +17823,6 @@
         <w:gridCol w:w="2014"/>
       </w:tblGrid>
       <w:tr>
-        <w:tblPrEx>
-          <w:tblCellMar>
-            <w:top w:w="0" w:type="dxa"/>
-            <w:bottom w:w="0" w:type="dxa"/>
-          </w:tblCellMar>
-        </w:tblPrEx>
         <w:trPr>
           <w:tblHeader/>
         </w:trPr>
@@ -18495,12 +18028,6 @@
         </w:tc>
       </w:tr>
       <w:tr>
-        <w:tblPrEx>
-          <w:tblCellMar>
-            <w:top w:w="0" w:type="dxa"/>
-            <w:bottom w:w="0" w:type="dxa"/>
-          </w:tblCellMar>
-        </w:tblPrEx>
         <w:tc>
           <w:tcPr>
             <w:tcW w:w="3200" w:type="dxa"/>
@@ -18692,12 +18219,6 @@
         </w:tc>
       </w:tr>
       <w:tr>
-        <w:tblPrEx>
-          <w:tblCellMar>
-            <w:top w:w="0" w:type="dxa"/>
-            <w:bottom w:w="0" w:type="dxa"/>
-          </w:tblCellMar>
-        </w:tblPrEx>
         <w:tc>
           <w:tcPr>
             <w:tcW w:w="3200" w:type="dxa"/>
@@ -18731,6 +18252,7 @@
                 <w:sz w:val="24"/>
                 <w:szCs w:val="24"/>
               </w:rPr>
+              <w:lastRenderedPageBreak/>
               <w:t>1991–2003 (Const. 91)</w:t>
             </w:r>
           </w:p>
@@ -18889,12 +18411,6 @@
         </w:tc>
       </w:tr>
       <w:tr>
-        <w:tblPrEx>
-          <w:tblCellMar>
-            <w:top w:w="0" w:type="dxa"/>
-            <w:bottom w:w="0" w:type="dxa"/>
-          </w:tblCellMar>
-        </w:tblPrEx>
         <w:tc>
           <w:tcPr>
             <w:tcW w:w="3200" w:type="dxa"/>
@@ -19086,12 +18602,6 @@
         </w:tc>
       </w:tr>
       <w:tr>
-        <w:tblPrEx>
-          <w:tblCellMar>
-            <w:top w:w="0" w:type="dxa"/>
-            <w:bottom w:w="0" w:type="dxa"/>
-          </w:tblCellMar>
-        </w:tblPrEx>
         <w:tc>
           <w:tcPr>
             <w:tcW w:w="3200" w:type="dxa"/>

</xml_diff>